<commit_message>
Improved Headers vy adding Unicode emoji's
</commit_message>
<xml_diff>
--- a/AJAYKUMAR_DHANDAPANI.docx
+++ b/AJAYKUMAR_DHANDAPANI.docx
@@ -2261,10 +2261,7 @@
         <w:spacing w:after="0"/>
       </w:pPr>
       <w:r>
-        <w:t>P</w:t>
-      </w:r>
-      <w:r>
-        <w:t>erformed root cause analysis and implemented a solution to address high memory consumption in the MyHR application, reducing operational costs and improving system availability by preventing frequent outages</w:t>
+        <w:t>Performed root cause analysis and implemented a solution to address high memory consumption in the MyHR application, reducing operational costs and improving system availability by preventing frequent outages</w:t>
       </w:r>
     </w:p>
     <w:p>
@@ -5360,7 +5357,6 @@
       <w:footerReference w:type="even" r:id="rId10"/>
       <w:footerReference w:type="default" r:id="rId11"/>
       <w:headerReference w:type="first" r:id="rId12"/>
-      <w:footerReference w:type="first" r:id="rId13"/>
       <w:pgSz w:w="11906" w:h="16838"/>
       <w:pgMar w:top="720" w:right="720" w:bottom="720" w:left="720" w:header="0" w:footer="0" w:gutter="0"/>
       <w:pgBorders w:offsetFrom="page">
@@ -5696,16 +5692,6 @@
       </w:rPr>
       <w:t xml:space="preserve"> </w:t>
     </w:r>
-  </w:p>
-</w:ftr>
-</file>
-
-<file path=word/footer3.xml><?xml version="1.0" encoding="utf-8"?>
-<w:ftr xmlns:wpc="http://schemas.microsoft.com/office/word/2010/wordprocessingCanvas" xmlns:cx="http://schemas.microsoft.com/office/drawing/2014/chartex" xmlns:cx1="http://schemas.microsoft.com/office/drawing/2015/9/8/chartex" xmlns:cx2="http://schemas.microsoft.com/office/drawing/2015/10/21/chartex" xmlns:cx3="http://schemas.microsoft.com/office/drawing/2016/5/9/chartex" xmlns:cx4="http://schemas.microsoft.com/office/drawing/2016/5/10/chartex" xmlns:cx5="http://schemas.microsoft.com/office/drawing/2016/5/11/chartex" xmlns:cx6="http://schemas.microsoft.com/office/drawing/2016/5/12/chartex" xmlns:cx7="http://schemas.microsoft.com/office/drawing/2016/5/13/chartex" xmlns:cx8="http://schemas.microsoft.com/office/drawing/2016/5/14/chartex" xmlns:mc="http://schemas.openxmlformats.org/markup-compatibility/2006" xmlns:aink="http://schemas.microsoft.com/office/drawing/2016/ink" xmlns:am3d="http://schemas.microsoft.com/office/drawing/2017/model3d" xmlns:o="urn:schemas-microsoft-com:office:office" xmlns:oel="http://schemas.microsoft.com/office/2019/extlst" xmlns:r="http://schemas.openxmlformats.org/officeDocument/2006/relationships" xmlns:m="http://schemas.openxmlformats.org/officeDocument/2006/math" xmlns:v="urn:schemas-microsoft-com:vml" xmlns:wp14="http://schemas.microsoft.com/office/word/2010/wordprocessingDrawing" xmlns:wp="http://schemas.openxmlformats.org/drawingml/2006/wordprocessingDrawing" xmlns:w10="urn:schemas-microsoft-com:office:word" xmlns:w="http://schemas.openxmlformats.org/wordprocessingml/2006/main" xmlns:w14="http://schemas.microsoft.com/office/word/2010/wordml" xmlns:w15="http://schemas.microsoft.com/office/word/2012/wordml" xmlns:w16cex="http://schemas.microsoft.com/office/word/2018/wordml/cex" xmlns:w16cid="http://schemas.microsoft.com/office/word/2016/wordml/cid" xmlns:w16="http://schemas.microsoft.com/office/word/2018/wordml" xmlns:w16du="http://schemas.microsoft.com/office/word/2023/wordml/word16du" xmlns:w16sdtdh="http://schemas.microsoft.com/office/word/2020/wordml/sdtdatahash" xmlns:w16sdtfl="http://schemas.microsoft.com/office/word/2024/wordml/sdtformatlock" xmlns:w16se="http://schemas.microsoft.com/office/word/2015/wordml/symex" xmlns:wpg="http://schemas.microsoft.com/office/word/2010/wordprocessingGroup" xmlns:wpi="http://schemas.microsoft.com/office/word/2010/wordprocessingInk" xmlns:wne="http://schemas.microsoft.com/office/word/2006/wordml" xmlns:wps="http://schemas.microsoft.com/office/word/2010/wordprocessingShape" mc:Ignorable="w14 w15 w16se w16cid w16 w16cex w16sdtdh w16sdtfl w16du wp14">
-  <w:p>
-    <w:pPr>
-      <w:pStyle w:val="Footer"/>
-    </w:pPr>
   </w:p>
 </w:ftr>
 </file>
@@ -5924,8 +5910,8 @@
         <w:rStyle w:val="BookTitle"/>
         <w:rFonts w:asciiTheme="minorHAnsi" w:hAnsiTheme="minorHAnsi" w:cstheme="minorHAnsi"/>
         <w:b w:val="0"/>
-        <w:sz w:val="28"/>
-        <w:szCs w:val="28"/>
+        <w:sz w:val="21"/>
+        <w:szCs w:val="21"/>
         <w:lang w:val="en-GB"/>
       </w:rPr>
     </w:pPr>
@@ -5956,7 +5942,19 @@
         <w:szCs w:val="21"/>
         <w:lang w:val="en-GB"/>
       </w:rPr>
-      <w:t xml:space="preserve"> Ludwigsburg - 71634, Germany </w:t>
+      <w:t xml:space="preserve">Ludwigsburg - 71634, Germany </w:t>
+    </w:r>
+    <w:r>
+      <w:rPr>
+        <w:rStyle w:val="BookTitle"/>
+        <w:rFonts w:asciiTheme="minorHAnsi" w:hAnsiTheme="minorHAnsi" w:cstheme="minorHAnsi"/>
+        <w:b w:val="0"/>
+        <w:i/>
+        <w:sz w:val="21"/>
+        <w:szCs w:val="21"/>
+        <w:lang w:val="en-GB"/>
+      </w:rPr>
+      <w:t xml:space="preserve"> </w:t>
     </w:r>
     <w:r>
       <w:rPr>
@@ -5984,23 +5982,6 @@
     </w:r>
     <w:r>
       <w:rPr>
-        <w:rFonts w:ascii="Apple Color Emoji" w:hAnsi="Apple Color Emoji" w:cs="Apple Color Emoji"/>
-        <w:sz w:val="21"/>
-        <w:szCs w:val="21"/>
-      </w:rPr>
-      <w:t>📱</w:t>
-    </w:r>
-    <w:r>
-      <w:rPr>
-        <w:rFonts w:asciiTheme="minorHAnsi" w:hAnsiTheme="minorHAnsi" w:cstheme="minorHAnsi"/>
-        <w:sz w:val="21"/>
-        <w:szCs w:val="21"/>
-        <w:lang w:val="en-GB"/>
-      </w:rPr>
-      <w:t xml:space="preserve"> </w:t>
-    </w:r>
-    <w:r>
-      <w:rPr>
         <w:rStyle w:val="BookTitle"/>
         <w:rFonts w:asciiTheme="minorHAnsi" w:hAnsiTheme="minorHAnsi" w:cstheme="minorHAnsi"/>
         <w:b w:val="0"/>
@@ -6009,6 +5990,35 @@
         <w:szCs w:val="21"/>
         <w:lang w:val="en-GB"/>
       </w:rPr>
+      <w:t xml:space="preserve"> </w:t>
+    </w:r>
+    <w:r>
+      <w:rPr>
+        <w:rFonts w:ascii="Apple Color Emoji" w:hAnsi="Apple Color Emoji" w:cs="Apple Color Emoji"/>
+        <w:sz w:val="21"/>
+        <w:szCs w:val="21"/>
+      </w:rPr>
+      <w:t>📱</w:t>
+    </w:r>
+    <w:r>
+      <w:rPr>
+        <w:rFonts w:asciiTheme="minorHAnsi" w:hAnsiTheme="minorHAnsi" w:cstheme="minorHAnsi"/>
+        <w:sz w:val="21"/>
+        <w:szCs w:val="21"/>
+        <w:lang w:val="en-GB"/>
+      </w:rPr>
+      <w:t xml:space="preserve"> </w:t>
+    </w:r>
+    <w:r>
+      <w:rPr>
+        <w:rStyle w:val="BookTitle"/>
+        <w:rFonts w:asciiTheme="minorHAnsi" w:hAnsiTheme="minorHAnsi" w:cstheme="minorHAnsi"/>
+        <w:b w:val="0"/>
+        <w:i/>
+        <w:sz w:val="21"/>
+        <w:szCs w:val="21"/>
+        <w:lang w:val="en-GB"/>
+      </w:rPr>
       <w:t xml:space="preserve">+49-15171482540  </w:t>
     </w:r>
     <w:r>
@@ -6022,6 +6032,15 @@
         <w:lang w:val="en-GB"/>
       </w:rPr>
       <w:t>|</w:t>
+    </w:r>
+    <w:r>
+      <w:rPr>
+        <w:rFonts w:asciiTheme="minorHAnsi" w:hAnsiTheme="minorHAnsi" w:cstheme="minorHAnsi"/>
+        <w:sz w:val="21"/>
+        <w:szCs w:val="21"/>
+        <w:lang w:val="en-GB"/>
+      </w:rPr>
+      <w:t xml:space="preserve"> </w:t>
     </w:r>
     <w:r>
       <w:rPr>
@@ -6106,6 +6125,22 @@
         <w:szCs w:val="21"/>
       </w:rPr>
     </w:pPr>
+    <w:r>
+      <w:rPr>
+        <w:rFonts w:ascii="Apple Color Emoji" w:hAnsi="Apple Color Emoji" w:cs="Apple Color Emoji"/>
+        <w:sz w:val="21"/>
+        <w:szCs w:val="21"/>
+      </w:rPr>
+      <w:t>🪪</w:t>
+    </w:r>
+    <w:r>
+      <w:rPr>
+        <w:rFonts w:asciiTheme="minorHAnsi" w:hAnsiTheme="minorHAnsi" w:cstheme="minorHAnsi"/>
+        <w:sz w:val="21"/>
+        <w:szCs w:val="21"/>
+      </w:rPr>
+      <w:t xml:space="preserve"> </w:t>
+    </w:r>
     <w:r>
       <w:rPr>
         <w:rFonts w:asciiTheme="minorHAnsi" w:eastAsia="Times New Roman" w:hAnsiTheme="minorHAnsi" w:cstheme="minorHAnsi"/>
@@ -6167,6 +6202,22 @@
         <w:szCs w:val="21"/>
       </w:rPr>
     </w:pPr>
+    <w:r>
+      <w:rPr>
+        <w:rFonts w:ascii="Apple Color Emoji" w:hAnsi="Apple Color Emoji" w:cs="Apple Color Emoji"/>
+        <w:sz w:val="21"/>
+        <w:szCs w:val="21"/>
+      </w:rPr>
+      <w:t>🗣️</w:t>
+    </w:r>
+    <w:r>
+      <w:rPr>
+        <w:rFonts w:asciiTheme="minorHAnsi" w:hAnsiTheme="minorHAnsi" w:cstheme="minorHAnsi"/>
+        <w:sz w:val="21"/>
+        <w:szCs w:val="21"/>
+      </w:rPr>
+      <w:t xml:space="preserve"> </w:t>
+    </w:r>
     <w:r>
       <w:rPr>
         <w:rStyle w:val="BookTitle"/>

</xml_diff>

<commit_message>
Added System Design and enhance AI profile in CV
</commit_message>
<xml_diff>
--- a/AJAYKUMAR_DHANDAPANI.docx
+++ b/AJAYKUMAR_DHANDAPANI.docx
@@ -170,7 +170,13 @@
         </w:rPr>
       </w:pPr>
       <w:r>
-        <w:t>Experience integrating AI/ML solutions into enterprise systems, including LLM integrations, predictive analytics, and AI-powered application enhancements</w:t>
+        <w:t>Experience integrating AI/ML solutions into enterprise systems, including LLM integrations</w:t>
+      </w:r>
+      <w:r>
+        <w:t xml:space="preserve"> and </w:t>
+      </w:r>
+      <w:r>
+        <w:t>AI-powered application enhancements</w:t>
       </w:r>
     </w:p>
     <w:p>
@@ -387,8 +393,8 @@
         <w:tblLook w:val="0480" w:firstRow="0" w:lastRow="0" w:firstColumn="1" w:lastColumn="0" w:noHBand="0" w:noVBand="1"/>
       </w:tblPr>
       <w:tblGrid>
-        <w:gridCol w:w="3851"/>
-        <w:gridCol w:w="6615"/>
+        <w:gridCol w:w="3717"/>
+        <w:gridCol w:w="6749"/>
       </w:tblGrid>
       <w:tr>
         <w:trPr>
@@ -396,7 +402,7 @@
         </w:trPr>
         <w:tc>
           <w:tcPr>
-            <w:tcW w:w="4122" w:type="dxa"/>
+            <w:tcW w:w="3851" w:type="dxa"/>
             <w:tcBorders>
               <w:top w:val="nil"/>
               <w:bottom w:val="single" w:sz="2" w:space="0" w:color="BFBFBF"/>
@@ -428,7 +434,7 @@
         </w:tc>
         <w:tc>
           <w:tcPr>
-            <w:tcW w:w="6560" w:type="dxa"/>
+            <w:tcW w:w="6615" w:type="dxa"/>
             <w:tcBorders>
               <w:top w:val="nil"/>
               <w:bottom w:val="single" w:sz="2" w:space="0" w:color="BFBFBF"/>
@@ -681,7 +687,17 @@
                 <w:sz w:val="20"/>
                 <w:szCs w:val="20"/>
               </w:rPr>
-              <w:t>, AI/ML Integration</w:t>
+              <w:t xml:space="preserve">, AI/ML </w:t>
+            </w:r>
+            <w:r>
+              <w:rPr>
+                <w:rFonts w:cs="Calibri"/>
+                <w:i w:val="0"/>
+                <w:iCs w:val="0"/>
+                <w:sz w:val="20"/>
+                <w:szCs w:val="20"/>
+              </w:rPr>
+              <w:t>powered enterprise apps</w:t>
             </w:r>
           </w:p>
         </w:tc>
@@ -774,6 +790,104 @@
                 <w:rFonts w:cs="Calibri"/>
                 <w:i w:val="0"/>
                 <w:iCs w:val="0"/>
+                <w:sz w:val="20"/>
+                <w:szCs w:val="20"/>
+              </w:rPr>
+            </w:pPr>
+            <w:r>
+              <w:rPr>
+                <w:rFonts w:cs="Calibri"/>
+                <w:i w:val="0"/>
+                <w:iCs w:val="0"/>
+                <w:sz w:val="20"/>
+                <w:szCs w:val="20"/>
+              </w:rPr>
+              <w:t>Artificial Intelligence</w:t>
+            </w:r>
+          </w:p>
+        </w:tc>
+        <w:tc>
+          <w:tcPr>
+            <w:tcW w:w="0" w:type="auto"/>
+            <w:tcBorders>
+              <w:top w:val="single" w:sz="2" w:space="0" w:color="BFBFBF"/>
+              <w:bottom w:val="single" w:sz="2" w:space="0" w:color="BFBFBF"/>
+            </w:tcBorders>
+          </w:tcPr>
+          <w:p>
+            <w:pPr>
+              <w:pStyle w:val="Quote"/>
+              <w:rPr>
+                <w:rFonts w:cs="Calibri"/>
+                <w:i w:val="0"/>
+                <w:iCs w:val="0"/>
+                <w:sz w:val="20"/>
+                <w:szCs w:val="20"/>
+              </w:rPr>
+            </w:pPr>
+            <w:r>
+              <w:rPr>
+                <w:rFonts w:cs="Calibri"/>
+                <w:i w:val="0"/>
+                <w:iCs w:val="0"/>
+                <w:sz w:val="20"/>
+                <w:szCs w:val="20"/>
+              </w:rPr>
+              <w:t>AI / ML Integration , Model Context Protocol ,</w:t>
+            </w:r>
+            <w:r>
+              <w:rPr>
+                <w:rFonts w:cs="Calibri"/>
+                <w:i w:val="0"/>
+                <w:iCs w:val="0"/>
+                <w:sz w:val="20"/>
+                <w:szCs w:val="20"/>
+              </w:rPr>
+              <w:t xml:space="preserve"> Retrieval-Augmented Generation,</w:t>
+            </w:r>
+            <w:r>
+              <w:rPr>
+                <w:rFonts w:cs="Calibri"/>
+                <w:i w:val="0"/>
+                <w:iCs w:val="0"/>
+                <w:sz w:val="20"/>
+                <w:szCs w:val="20"/>
+              </w:rPr>
+              <w:t xml:space="preserve"> LLM </w:t>
+            </w:r>
+            <w:r>
+              <w:rPr>
+                <w:rFonts w:cs="Calibri"/>
+                <w:i w:val="0"/>
+                <w:iCs w:val="0"/>
+                <w:sz w:val="20"/>
+                <w:szCs w:val="20"/>
+              </w:rPr>
+              <w:t>APIs</w:t>
+            </w:r>
+          </w:p>
+        </w:tc>
+      </w:tr>
+      <w:tr>
+        <w:trPr>
+          <w:trHeight w:val="284"/>
+        </w:trPr>
+        <w:tc>
+          <w:tcPr>
+            <w:tcW w:w="0" w:type="auto"/>
+            <w:tcBorders>
+              <w:top w:val="single" w:sz="2" w:space="0" w:color="BFBFBF"/>
+              <w:bottom w:val="single" w:sz="2" w:space="0" w:color="BFBFBF"/>
+            </w:tcBorders>
+            <w:shd w:val="clear" w:color="auto" w:fill="FFFFFF"/>
+          </w:tcPr>
+          <w:p>
+            <w:pPr>
+              <w:pStyle w:val="Quote"/>
+              <w:rPr>
+                <w:rFonts w:cs="Calibri"/>
+                <w:i w:val="0"/>
+                <w:iCs w:val="0"/>
                 <w:color w:val="0070C0"/>
                 <w:sz w:val="20"/>
                 <w:szCs w:val="20"/>
@@ -841,16 +955,6 @@
               </w:rPr>
               <w:t>tructure as Code)</w:t>
             </w:r>
-            <w:r>
-              <w:rPr>
-                <w:rFonts w:cs="Calibri"/>
-                <w:i w:val="0"/>
-                <w:iCs w:val="0"/>
-                <w:sz w:val="20"/>
-                <w:szCs w:val="20"/>
-              </w:rPr>
-              <w:t>, Jenkins</w:t>
-            </w:r>
           </w:p>
         </w:tc>
       </w:tr>
@@ -917,7 +1021,7 @@
                 <w:sz w:val="20"/>
                 <w:szCs w:val="20"/>
               </w:rPr>
-              <w:t>No SQL: Mongo DB, AWS Document DB</w:t>
+              <w:t>No SQL: MongoDB, AWS Document DB</w:t>
             </w:r>
             <w:r>
               <w:rPr>
@@ -928,7 +1032,7 @@
                 <w:szCs w:val="20"/>
               </w:rPr>
               <w:br/>
-              <w:t>Relational (Oracle, My SQL)</w:t>
+              <w:t>Relational (Oracle, MySQL)</w:t>
             </w:r>
           </w:p>
         </w:tc>
@@ -1094,36 +1198,12 @@
                 <w:sz w:val="20"/>
                 <w:szCs w:val="20"/>
               </w:rPr>
-              <w:t xml:space="preserve">Pi4j, Constrained Application Protocol, MQTT and </w:t>
+              <w:t>Pi4j, Constrained Application Protocol, MQTT</w:t>
             </w:r>
           </w:p>
         </w:tc>
       </w:tr>
     </w:tbl>
-    <w:p>
-      <w:pPr>
-        <w:rPr>
-          <w:rFonts w:cs="Calibri"/>
-          <w:b/>
-          <w:bCs/>
-          <w:color w:val="0070C0"/>
-          <w:sz w:val="24"/>
-          <w:szCs w:val="24"/>
-        </w:rPr>
-      </w:pPr>
-    </w:p>
-    <w:p>
-      <w:pPr>
-        <w:rPr>
-          <w:rFonts w:cs="Calibri"/>
-          <w:b/>
-          <w:bCs/>
-          <w:color w:val="0070C0"/>
-          <w:sz w:val="24"/>
-          <w:szCs w:val="24"/>
-        </w:rPr>
-      </w:pPr>
-    </w:p>
     <w:p>
       <w:pPr>
         <w:rPr>
@@ -5868,7 +5948,7 @@
         <w:szCs w:val="28"/>
         <w:lang w:val="en-GB"/>
       </w:rPr>
-      <w:t>- Web</w:t>
+      <w:t>–</w:t>
     </w:r>
     <w:r>
       <w:rPr>
@@ -5879,7 +5959,106 @@
         <w:szCs w:val="28"/>
         <w:lang w:val="en-GB"/>
       </w:rPr>
-      <w:t xml:space="preserve"> Applications | Cloud Native Apps | AI/ML Integration</w:t>
+      <w:t xml:space="preserve"> </w:t>
+    </w:r>
+    <w:r>
+      <w:rPr>
+        <w:rStyle w:val="BookTitle"/>
+        <w:rFonts w:asciiTheme="minorHAnsi" w:hAnsiTheme="minorHAnsi" w:cstheme="minorHAnsi"/>
+        <w:b w:val="0"/>
+        <w:sz w:val="28"/>
+        <w:szCs w:val="28"/>
+        <w:lang w:val="en-GB"/>
+      </w:rPr>
+      <w:t xml:space="preserve">System </w:t>
+    </w:r>
+    <w:r>
+      <w:rPr>
+        <w:rStyle w:val="BookTitle"/>
+        <w:rFonts w:asciiTheme="minorHAnsi" w:hAnsiTheme="minorHAnsi" w:cstheme="minorHAnsi"/>
+        <w:b w:val="0"/>
+        <w:sz w:val="28"/>
+        <w:szCs w:val="28"/>
+        <w:lang w:val="en-GB"/>
+      </w:rPr>
+      <w:t>Design</w:t>
+    </w:r>
+    <w:r>
+      <w:rPr>
+        <w:rStyle w:val="BookTitle"/>
+        <w:rFonts w:asciiTheme="minorHAnsi" w:hAnsiTheme="minorHAnsi" w:cstheme="minorHAnsi"/>
+        <w:b w:val="0"/>
+        <w:sz w:val="28"/>
+        <w:szCs w:val="28"/>
+        <w:lang w:val="en-GB"/>
+      </w:rPr>
+      <w:t xml:space="preserve"> | </w:t>
+    </w:r>
+    <w:r>
+      <w:rPr>
+        <w:rStyle w:val="BookTitle"/>
+        <w:rFonts w:asciiTheme="minorHAnsi" w:hAnsiTheme="minorHAnsi" w:cstheme="minorHAnsi"/>
+        <w:b w:val="0"/>
+        <w:sz w:val="28"/>
+        <w:szCs w:val="28"/>
+        <w:lang w:val="en-GB"/>
+      </w:rPr>
+      <w:t>Web</w:t>
+    </w:r>
+    <w:r>
+      <w:rPr>
+        <w:rStyle w:val="BookTitle"/>
+        <w:rFonts w:asciiTheme="minorHAnsi" w:hAnsiTheme="minorHAnsi" w:cstheme="minorHAnsi"/>
+        <w:b w:val="0"/>
+        <w:sz w:val="28"/>
+        <w:szCs w:val="28"/>
+        <w:lang w:val="en-GB"/>
+      </w:rPr>
+      <w:t xml:space="preserve"> </w:t>
+    </w:r>
+    <w:r>
+      <w:rPr>
+        <w:rStyle w:val="BookTitle"/>
+        <w:rFonts w:asciiTheme="minorHAnsi" w:hAnsiTheme="minorHAnsi" w:cstheme="minorHAnsi"/>
+        <w:b w:val="0"/>
+        <w:sz w:val="28"/>
+        <w:szCs w:val="28"/>
+        <w:lang w:val="en-GB"/>
+      </w:rPr>
+      <w:t>Apps</w:t>
+    </w:r>
+    <w:r>
+      <w:rPr>
+        <w:rStyle w:val="BookTitle"/>
+        <w:rFonts w:asciiTheme="minorHAnsi" w:hAnsiTheme="minorHAnsi" w:cstheme="minorHAnsi"/>
+        <w:b w:val="0"/>
+        <w:sz w:val="28"/>
+        <w:szCs w:val="28"/>
+        <w:lang w:val="en-GB"/>
+      </w:rPr>
+      <w:t xml:space="preserve"> | Cloud Native Apps | </w:t>
+    </w:r>
+    <w:r>
+      <w:rPr>
+        <w:rStyle w:val="BookTitle"/>
+        <w:rFonts w:asciiTheme="minorHAnsi" w:hAnsiTheme="minorHAnsi" w:cstheme="minorHAnsi"/>
+        <w:b w:val="0"/>
+        <w:sz w:val="28"/>
+        <w:szCs w:val="28"/>
+        <w:lang w:val="en-GB"/>
+      </w:rPr>
+      <w:br/>
+    </w:r>
+    <w:r>
+      <w:rPr>
+        <w:rStyle w:val="BookTitle"/>
+        <w:rFonts w:asciiTheme="minorHAnsi" w:hAnsiTheme="minorHAnsi" w:cstheme="minorHAnsi"/>
+        <w:b w:val="0"/>
+        <w:sz w:val="28"/>
+        <w:szCs w:val="28"/>
+        <w:lang w:val="en-GB"/>
+      </w:rPr>
+      <w:t>AI/ML Integration</w:t>
     </w:r>
   </w:p>
   <w:p>

</xml_diff>

<commit_message>
Skill & Technologies Optimization
Optimized Sills and Added graduation to header
</commit_message>
<xml_diff>
--- a/AJAYKUMAR_DHANDAPANI.docx
+++ b/AJAYKUMAR_DHANDAPANI.docx
@@ -201,7 +201,19 @@
         <w:rPr>
           <w:rFonts w:cs="Calibri"/>
         </w:rPr>
-        <w:t xml:space="preserve"> at translating complex requirements into scalable, lightweight system designs with a strong grounding in design principles and clean architecture</w:t>
+        <w:t xml:space="preserve"> at translating complex requirements into scalable</w:t>
+      </w:r>
+      <w:r>
+        <w:rPr>
+          <w:rFonts w:cs="Calibri"/>
+        </w:rPr>
+        <w:t xml:space="preserve"> </w:t>
+      </w:r>
+      <w:r>
+        <w:rPr>
+          <w:rFonts w:cs="Calibri"/>
+        </w:rPr>
+        <w:t>system designs with a strong grounding in design principles and clean architecture</w:t>
       </w:r>
     </w:p>
     <w:p>
@@ -243,6 +255,7 @@
     </w:p>
     <w:p>
       <w:pPr>
+        <w:ind w:left="720"/>
         <w:rPr>
           <w:rFonts w:cs="Calibri"/>
           <w:sz w:val="20"/>
@@ -252,6 +265,7 @@
     </w:p>
     <w:p>
       <w:pPr>
+        <w:spacing w:line="240" w:lineRule="auto"/>
         <w:rPr>
           <w:rFonts w:cs="Calibri"/>
           <w:b/>
@@ -387,22 +401,29 @@
     <w:tbl>
       <w:tblPr>
         <w:tblW w:w="0" w:type="auto"/>
+        <w:tblInd w:w="-108" w:type="dxa"/>
         <w:tblBorders>
           <w:insideH w:val="single" w:sz="2" w:space="0" w:color="BFBFBF"/>
         </w:tblBorders>
         <w:tblLook w:val="0480" w:firstRow="0" w:lastRow="0" w:firstColumn="1" w:lastColumn="0" w:noHBand="0" w:noVBand="1"/>
       </w:tblPr>
       <w:tblGrid>
-        <w:gridCol w:w="3717"/>
-        <w:gridCol w:w="6749"/>
+        <w:gridCol w:w="108"/>
+        <w:gridCol w:w="3720"/>
+        <w:gridCol w:w="108"/>
+        <w:gridCol w:w="6530"/>
+        <w:gridCol w:w="108"/>
       </w:tblGrid>
       <w:tr>
         <w:trPr>
+          <w:gridBefore w:val="1"/>
+          <w:wBefore w:w="108" w:type="dxa"/>
           <w:trHeight w:val="567"/>
         </w:trPr>
         <w:tc>
           <w:tcPr>
-            <w:tcW w:w="3851" w:type="dxa"/>
+            <w:tcW w:w="3828" w:type="dxa"/>
+            <w:gridSpan w:val="2"/>
             <w:tcBorders>
               <w:top w:val="nil"/>
               <w:bottom w:val="single" w:sz="2" w:space="0" w:color="BFBFBF"/>
@@ -411,6 +432,7 @@
           </w:tcPr>
           <w:p>
             <w:pPr>
+              <w:spacing w:line="240" w:lineRule="auto"/>
               <w:jc w:val="center"/>
               <w:rPr>
                 <w:rFonts w:cs="Calibri"/>
@@ -434,7 +456,8 @@
         </w:tc>
         <w:tc>
           <w:tcPr>
-            <w:tcW w:w="6615" w:type="dxa"/>
+            <w:tcW w:w="6638" w:type="dxa"/>
+            <w:gridSpan w:val="2"/>
             <w:tcBorders>
               <w:top w:val="nil"/>
               <w:bottom w:val="single" w:sz="2" w:space="0" w:color="BFBFBF"/>
@@ -442,6 +465,7 @@
           </w:tcPr>
           <w:p>
             <w:pPr>
+              <w:spacing w:line="240" w:lineRule="auto"/>
               <w:jc w:val="center"/>
               <w:rPr>
                 <w:rFonts w:cs="Calibri"/>
@@ -459,18 +483,21 @@
                 <w:szCs w:val="24"/>
                 <w:lang w:val="en-DE"/>
               </w:rPr>
-              <w:t>Skills &amp; Tools</w:t>
+              <w:t>Technologies</w:t>
             </w:r>
           </w:p>
         </w:tc>
       </w:tr>
       <w:tr>
         <w:trPr>
+          <w:gridAfter w:val="1"/>
+          <w:wAfter w:w="108" w:type="dxa"/>
           <w:trHeight w:val="284"/>
         </w:trPr>
         <w:tc>
           <w:tcPr>
-            <w:tcW w:w="0" w:type="auto"/>
+            <w:tcW w:w="3828" w:type="dxa"/>
+            <w:gridSpan w:val="2"/>
             <w:tcBorders>
               <w:top w:val="single" w:sz="2" w:space="0" w:color="BFBFBF"/>
               <w:bottom w:val="single" w:sz="2" w:space="0" w:color="BFBFBF"/>
@@ -480,6 +507,8 @@
           <w:p>
             <w:pPr>
               <w:pStyle w:val="Quote"/>
+              <w:spacing w:line="240" w:lineRule="auto"/>
+              <w:jc w:val="both"/>
               <w:rPr>
                 <w:rFonts w:cs="Calibri"/>
                 <w:i w:val="0"/>
@@ -496,7 +525,7 @@
                 <w:sz w:val="20"/>
                 <w:szCs w:val="20"/>
               </w:rPr>
-              <w:t xml:space="preserve">Programming Languages </w:t>
+              <w:t>Programming</w:t>
             </w:r>
             <w:r>
               <w:rPr>
@@ -506,13 +535,24 @@
                 <w:sz w:val="20"/>
                 <w:szCs w:val="20"/>
               </w:rPr>
-              <w:t>&amp; Frameworks</w:t>
+              <w:t xml:space="preserve"> </w:t>
+            </w:r>
+            <w:r>
+              <w:rPr>
+                <w:rFonts w:cs="Calibri"/>
+                <w:i w:val="0"/>
+                <w:iCs w:val="0"/>
+                <w:sz w:val="20"/>
+                <w:szCs w:val="20"/>
+              </w:rPr>
+              <w:t>Languages</w:t>
             </w:r>
           </w:p>
         </w:tc>
         <w:tc>
           <w:tcPr>
-            <w:tcW w:w="0" w:type="auto"/>
+            <w:tcW w:w="6638" w:type="dxa"/>
+            <w:gridSpan w:val="2"/>
             <w:tcBorders>
               <w:top w:val="single" w:sz="2" w:space="0" w:color="BFBFBF"/>
               <w:bottom w:val="single" w:sz="2" w:space="0" w:color="BFBFBF"/>
@@ -521,6 +561,7 @@
           <w:p>
             <w:pPr>
               <w:pStyle w:val="Quote"/>
+              <w:spacing w:line="240" w:lineRule="auto"/>
               <w:rPr>
                 <w:rFonts w:cs="Calibri"/>
                 <w:i w:val="0"/>
@@ -537,7 +578,91 @@
                 <w:sz w:val="20"/>
                 <w:szCs w:val="20"/>
               </w:rPr>
-              <w:t>Java, Python, Rust, Java Script</w:t>
+              <w:t>Java, Python, Rust, JavaScript</w:t>
+            </w:r>
+          </w:p>
+        </w:tc>
+      </w:tr>
+      <w:tr>
+        <w:trPr>
+          <w:gridAfter w:val="1"/>
+          <w:wAfter w:w="108" w:type="dxa"/>
+          <w:trHeight w:val="284"/>
+        </w:trPr>
+        <w:tc>
+          <w:tcPr>
+            <w:tcW w:w="3828" w:type="dxa"/>
+            <w:gridSpan w:val="2"/>
+            <w:tcBorders>
+              <w:top w:val="single" w:sz="2" w:space="0" w:color="BFBFBF"/>
+              <w:bottom w:val="single" w:sz="2" w:space="0" w:color="BFBFBF"/>
+            </w:tcBorders>
+            <w:shd w:val="clear" w:color="auto" w:fill="FFFFFF"/>
+          </w:tcPr>
+          <w:p>
+            <w:pPr>
+              <w:pStyle w:val="Quote"/>
+              <w:spacing w:line="240" w:lineRule="auto"/>
+              <w:rPr>
+                <w:rFonts w:cs="Calibri"/>
+                <w:i w:val="0"/>
+                <w:iCs w:val="0"/>
+                <w:sz w:val="20"/>
+                <w:szCs w:val="20"/>
+              </w:rPr>
+            </w:pPr>
+            <w:r>
+              <w:rPr>
+                <w:rFonts w:cs="Calibri"/>
+                <w:i w:val="0"/>
+                <w:iCs w:val="0"/>
+                <w:sz w:val="20"/>
+                <w:szCs w:val="20"/>
+              </w:rPr>
+              <w:t>Frameworks</w:t>
+            </w:r>
+          </w:p>
+        </w:tc>
+        <w:tc>
+          <w:tcPr>
+            <w:tcW w:w="6638" w:type="dxa"/>
+            <w:gridSpan w:val="2"/>
+            <w:tcBorders>
+              <w:top w:val="single" w:sz="2" w:space="0" w:color="BFBFBF"/>
+              <w:bottom w:val="single" w:sz="2" w:space="0" w:color="BFBFBF"/>
+            </w:tcBorders>
+          </w:tcPr>
+          <w:p>
+            <w:pPr>
+              <w:pStyle w:val="Quote"/>
+              <w:spacing w:line="240" w:lineRule="auto"/>
+              <w:rPr>
+                <w:rFonts w:cs="Calibri"/>
+                <w:i w:val="0"/>
+                <w:iCs w:val="0"/>
+                <w:sz w:val="20"/>
+                <w:szCs w:val="20"/>
+              </w:rPr>
+            </w:pPr>
+            <w:r>
+              <w:rPr>
+                <w:rFonts w:cs="Calibri"/>
+                <w:i w:val="0"/>
+                <w:iCs w:val="0"/>
+                <w:sz w:val="20"/>
+                <w:szCs w:val="20"/>
+              </w:rPr>
+              <w:t xml:space="preserve">Spring Boot, Spring Webflux, Spring Security, Spring AI, </w:t>
+            </w:r>
+            <w:r>
+              <w:rPr>
+                <w:rFonts w:cs="Calibri"/>
+                <w:i w:val="0"/>
+                <w:iCs w:val="0"/>
+                <w:sz w:val="20"/>
+                <w:szCs w:val="20"/>
+              </w:rPr>
+              <w:t>J2EE</w:t>
             </w:r>
             <w:r>
               <w:rPr>
@@ -557,7 +682,50 @@
                 <w:sz w:val="20"/>
                 <w:szCs w:val="20"/>
               </w:rPr>
-              <w:t>J2EE,</w:t>
+              <w:t>REST API’s</w:t>
+            </w:r>
+          </w:p>
+        </w:tc>
+      </w:tr>
+      <w:tr>
+        <w:trPr>
+          <w:gridAfter w:val="1"/>
+          <w:wAfter w:w="108" w:type="dxa"/>
+          <w:trHeight w:val="284"/>
+        </w:trPr>
+        <w:tc>
+          <w:tcPr>
+            <w:tcW w:w="3828" w:type="dxa"/>
+            <w:gridSpan w:val="2"/>
+            <w:tcBorders>
+              <w:top w:val="single" w:sz="2" w:space="0" w:color="BFBFBF"/>
+              <w:bottom w:val="single" w:sz="2" w:space="0" w:color="BFBFBF"/>
+            </w:tcBorders>
+            <w:shd w:val="clear" w:color="auto" w:fill="FFFFFF"/>
+          </w:tcPr>
+          <w:p>
+            <w:pPr>
+              <w:pStyle w:val="Quote"/>
+              <w:spacing w:line="240" w:lineRule="auto"/>
+              <w:rPr>
+                <w:rFonts w:cs="Calibri"/>
+                <w:i w:val="0"/>
+                <w:iCs w:val="0"/>
+                <w:color w:val="0070C0"/>
+                <w:sz w:val="20"/>
+                <w:szCs w:val="20"/>
+                <w:lang w:val="en-DE"/>
+              </w:rPr>
+            </w:pPr>
+            <w:r>
+              <w:rPr>
+                <w:rFonts w:cs="Calibri"/>
+                <w:i w:val="0"/>
+                <w:iCs w:val="0"/>
+                <w:sz w:val="20"/>
+                <w:szCs w:val="20"/>
+              </w:rPr>
+              <w:t xml:space="preserve">Architecture &amp; </w:t>
             </w:r>
             <w:r>
               <w:rPr>
@@ -567,7 +735,40 @@
                 <w:sz w:val="20"/>
                 <w:szCs w:val="20"/>
               </w:rPr>
-              <w:t xml:space="preserve"> Spring</w:t>
+              <w:t>Design</w:t>
+            </w:r>
+          </w:p>
+        </w:tc>
+        <w:tc>
+          <w:tcPr>
+            <w:tcW w:w="6638" w:type="dxa"/>
+            <w:gridSpan w:val="2"/>
+            <w:tcBorders>
+              <w:top w:val="single" w:sz="2" w:space="0" w:color="BFBFBF"/>
+              <w:bottom w:val="single" w:sz="2" w:space="0" w:color="BFBFBF"/>
+            </w:tcBorders>
+          </w:tcPr>
+          <w:p>
+            <w:pPr>
+              <w:pStyle w:val="Quote"/>
+              <w:spacing w:line="240" w:lineRule="auto"/>
+              <w:rPr>
+                <w:rFonts w:cs="Calibri"/>
+                <w:i w:val="0"/>
+                <w:iCs w:val="0"/>
+                <w:sz w:val="20"/>
+                <w:szCs w:val="20"/>
+              </w:rPr>
+            </w:pPr>
+            <w:r>
+              <w:rPr>
+                <w:rFonts w:cs="Calibri"/>
+                <w:i w:val="0"/>
+                <w:iCs w:val="0"/>
+                <w:sz w:val="20"/>
+                <w:szCs w:val="20"/>
+              </w:rPr>
+              <w:t xml:space="preserve">Enterprise Web </w:t>
             </w:r>
             <w:r>
               <w:rPr>
@@ -577,7 +778,27 @@
                 <w:sz w:val="20"/>
                 <w:szCs w:val="20"/>
               </w:rPr>
-              <w:t xml:space="preserve"> Boot</w:t>
+              <w:t>Applications</w:t>
+            </w:r>
+            <w:r>
+              <w:rPr>
+                <w:rFonts w:cs="Calibri"/>
+                <w:i w:val="0"/>
+                <w:iCs w:val="0"/>
+                <w:sz w:val="20"/>
+                <w:szCs w:val="20"/>
+              </w:rPr>
+              <w:t>, Microservices</w:t>
+            </w:r>
+            <w:r>
+              <w:rPr>
+                <w:rFonts w:cs="Calibri"/>
+                <w:i w:val="0"/>
+                <w:iCs w:val="0"/>
+                <w:sz w:val="20"/>
+                <w:szCs w:val="20"/>
+              </w:rPr>
+              <w:t xml:space="preserve"> Architecture</w:t>
             </w:r>
             <w:r>
               <w:rPr>
@@ -597,7 +818,7 @@
                 <w:sz w:val="20"/>
                 <w:szCs w:val="20"/>
               </w:rPr>
-              <w:t>Spring Webflux, Spring Security</w:t>
+              <w:t xml:space="preserve">Cloud Native Applications, </w:t>
             </w:r>
             <w:r>
               <w:rPr>
@@ -607,18 +828,41 @@
                 <w:sz w:val="20"/>
                 <w:szCs w:val="20"/>
               </w:rPr>
-              <w:t>, Spring AI</w:t>
+              <w:t xml:space="preserve">Event Drive Architecture, </w:t>
+            </w:r>
+            <w:r>
+              <w:rPr>
+                <w:rFonts w:cs="Calibri"/>
+                <w:i w:val="0"/>
+                <w:iCs w:val="0"/>
+                <w:sz w:val="20"/>
+                <w:szCs w:val="20"/>
+              </w:rPr>
+              <w:t xml:space="preserve">Serverless </w:t>
+            </w:r>
+            <w:r>
+              <w:rPr>
+                <w:rFonts w:cs="Calibri"/>
+                <w:i w:val="0"/>
+                <w:iCs w:val="0"/>
+                <w:sz w:val="20"/>
+                <w:szCs w:val="20"/>
+              </w:rPr>
+              <w:t>Architecture</w:t>
             </w:r>
           </w:p>
         </w:tc>
       </w:tr>
       <w:tr>
         <w:trPr>
+          <w:gridAfter w:val="1"/>
+          <w:wAfter w:w="108" w:type="dxa"/>
           <w:trHeight w:val="284"/>
         </w:trPr>
         <w:tc>
           <w:tcPr>
-            <w:tcW w:w="0" w:type="auto"/>
+            <w:tcW w:w="3828" w:type="dxa"/>
+            <w:gridSpan w:val="2"/>
             <w:tcBorders>
               <w:top w:val="single" w:sz="2" w:space="0" w:color="BFBFBF"/>
               <w:bottom w:val="single" w:sz="2" w:space="0" w:color="BFBFBF"/>
@@ -628,96 +872,7 @@
           <w:p>
             <w:pPr>
               <w:pStyle w:val="Quote"/>
-              <w:rPr>
-                <w:rFonts w:cs="Calibri"/>
-                <w:i w:val="0"/>
-                <w:iCs w:val="0"/>
-                <w:color w:val="0070C0"/>
-                <w:sz w:val="20"/>
-                <w:szCs w:val="20"/>
-                <w:lang w:val="en-DE"/>
-              </w:rPr>
-            </w:pPr>
-            <w:r>
-              <w:rPr>
-                <w:rFonts w:cs="Calibri"/>
-                <w:i w:val="0"/>
-                <w:iCs w:val="0"/>
-                <w:sz w:val="20"/>
-                <w:szCs w:val="20"/>
-              </w:rPr>
-              <w:t>Architecture &amp; Paradigms</w:t>
-            </w:r>
-          </w:p>
-        </w:tc>
-        <w:tc>
-          <w:tcPr>
-            <w:tcW w:w="0" w:type="auto"/>
-            <w:tcBorders>
-              <w:top w:val="single" w:sz="2" w:space="0" w:color="BFBFBF"/>
-              <w:bottom w:val="single" w:sz="2" w:space="0" w:color="BFBFBF"/>
-            </w:tcBorders>
-          </w:tcPr>
-          <w:p>
-            <w:pPr>
-              <w:pStyle w:val="Quote"/>
-              <w:rPr>
-                <w:rFonts w:cs="Calibri"/>
-                <w:i w:val="0"/>
-                <w:iCs w:val="0"/>
-                <w:sz w:val="20"/>
-                <w:szCs w:val="20"/>
-              </w:rPr>
-            </w:pPr>
-            <w:r>
-              <w:rPr>
-                <w:rFonts w:cs="Calibri"/>
-                <w:i w:val="0"/>
-                <w:iCs w:val="0"/>
-                <w:sz w:val="20"/>
-                <w:szCs w:val="20"/>
-              </w:rPr>
-              <w:t>Enterprise Web Apps, Microservices, Serverless Functions, Cloud Native Apps</w:t>
-            </w:r>
-            <w:r>
-              <w:rPr>
-                <w:rFonts w:cs="Calibri"/>
-                <w:i w:val="0"/>
-                <w:iCs w:val="0"/>
-                <w:sz w:val="20"/>
-                <w:szCs w:val="20"/>
-              </w:rPr>
-              <w:t xml:space="preserve">, AI/ML </w:t>
-            </w:r>
-            <w:r>
-              <w:rPr>
-                <w:rFonts w:cs="Calibri"/>
-                <w:i w:val="0"/>
-                <w:iCs w:val="0"/>
-                <w:sz w:val="20"/>
-                <w:szCs w:val="20"/>
-              </w:rPr>
-              <w:t>powered enterprise apps</w:t>
-            </w:r>
-          </w:p>
-        </w:tc>
-      </w:tr>
-      <w:tr>
-        <w:trPr>
-          <w:trHeight w:val="284"/>
-        </w:trPr>
-        <w:tc>
-          <w:tcPr>
-            <w:tcW w:w="0" w:type="auto"/>
-            <w:tcBorders>
-              <w:top w:val="single" w:sz="2" w:space="0" w:color="BFBFBF"/>
-              <w:bottom w:val="single" w:sz="2" w:space="0" w:color="BFBFBF"/>
-            </w:tcBorders>
-            <w:shd w:val="clear" w:color="auto" w:fill="FFFFFF"/>
-          </w:tcPr>
-          <w:p>
-            <w:pPr>
-              <w:pStyle w:val="Quote"/>
+              <w:spacing w:line="240" w:lineRule="auto"/>
               <w:rPr>
                 <w:rFonts w:cs="Calibri"/>
                 <w:i w:val="0"/>
@@ -740,7 +895,8 @@
         </w:tc>
         <w:tc>
           <w:tcPr>
-            <w:tcW w:w="0" w:type="auto"/>
+            <w:tcW w:w="6638" w:type="dxa"/>
+            <w:gridSpan w:val="2"/>
             <w:tcBorders>
               <w:top w:val="single" w:sz="2" w:space="0" w:color="BFBFBF"/>
               <w:bottom w:val="single" w:sz="2" w:space="0" w:color="BFBFBF"/>
@@ -749,6 +905,7 @@
           <w:p>
             <w:pPr>
               <w:pStyle w:val="Quote"/>
+              <w:spacing w:line="240" w:lineRule="auto"/>
               <w:rPr>
                 <w:rFonts w:cs="Calibri"/>
                 <w:i w:val="0"/>
@@ -765,18 +922,61 @@
                 <w:sz w:val="20"/>
                 <w:szCs w:val="20"/>
               </w:rPr>
-              <w:t>AWS, Microsoft Azure, Pivotal, Heroku</w:t>
+              <w:t>AWS, Microsoft Azure, Pivotal</w:t>
+            </w:r>
+            <w:r>
+              <w:rPr>
+                <w:rFonts w:cs="Calibri"/>
+                <w:i w:val="0"/>
+                <w:iCs w:val="0"/>
+                <w:sz w:val="20"/>
+                <w:szCs w:val="20"/>
+              </w:rPr>
+              <w:t xml:space="preserve"> Cloud Foun</w:t>
+            </w:r>
+            <w:r>
+              <w:rPr>
+                <w:rFonts w:cs="Calibri"/>
+                <w:i w:val="0"/>
+                <w:iCs w:val="0"/>
+                <w:sz w:val="20"/>
+                <w:szCs w:val="20"/>
+              </w:rPr>
+              <w:t>d</w:t>
+            </w:r>
+            <w:r>
+              <w:rPr>
+                <w:rFonts w:cs="Calibri"/>
+                <w:i w:val="0"/>
+                <w:iCs w:val="0"/>
+                <w:sz w:val="20"/>
+                <w:szCs w:val="20"/>
+              </w:rPr>
+              <w:t>ry</w:t>
+            </w:r>
+            <w:r>
+              <w:rPr>
+                <w:rFonts w:cs="Calibri"/>
+                <w:i w:val="0"/>
+                <w:iCs w:val="0"/>
+                <w:sz w:val="20"/>
+                <w:szCs w:val="20"/>
+              </w:rPr>
+              <w:t>, Heroku</w:t>
             </w:r>
           </w:p>
         </w:tc>
       </w:tr>
       <w:tr>
         <w:trPr>
+          <w:gridAfter w:val="1"/>
+          <w:wAfter w:w="108" w:type="dxa"/>
           <w:trHeight w:val="284"/>
         </w:trPr>
         <w:tc>
           <w:tcPr>
-            <w:tcW w:w="0" w:type="auto"/>
+            <w:tcW w:w="3828" w:type="dxa"/>
+            <w:gridSpan w:val="2"/>
             <w:tcBorders>
               <w:top w:val="single" w:sz="2" w:space="0" w:color="BFBFBF"/>
               <w:bottom w:val="single" w:sz="2" w:space="0" w:color="BFBFBF"/>
@@ -786,6 +986,7 @@
           <w:p>
             <w:pPr>
               <w:pStyle w:val="Quote"/>
+              <w:spacing w:line="240" w:lineRule="auto"/>
               <w:rPr>
                 <w:rFonts w:cs="Calibri"/>
                 <w:i w:val="0"/>
@@ -802,13 +1003,41 @@
                 <w:sz w:val="20"/>
                 <w:szCs w:val="20"/>
               </w:rPr>
-              <w:t>Artificial Intelligence</w:t>
+              <w:t>AI (Artifi</w:t>
+            </w:r>
+            <w:r>
+              <w:rPr>
+                <w:rFonts w:cs="Calibri"/>
+                <w:i w:val="0"/>
+                <w:iCs w:val="0"/>
+                <w:sz w:val="20"/>
+                <w:szCs w:val="20"/>
+              </w:rPr>
+              <w:t>c</w:t>
+            </w:r>
+            <w:r>
+              <w:rPr>
+                <w:rFonts w:cs="Calibri"/>
+                <w:i w:val="0"/>
+              </w:rPr>
+              <w:t>ial Intelligence</w:t>
+            </w:r>
+            <w:r>
+              <w:rPr>
+                <w:rFonts w:cs="Calibri"/>
+                <w:i w:val="0"/>
+                <w:iCs w:val="0"/>
+                <w:sz w:val="20"/>
+                <w:szCs w:val="20"/>
+              </w:rPr>
+              <w:t>)</w:t>
             </w:r>
           </w:p>
         </w:tc>
         <w:tc>
           <w:tcPr>
-            <w:tcW w:w="0" w:type="auto"/>
+            <w:tcW w:w="6638" w:type="dxa"/>
+            <w:gridSpan w:val="2"/>
             <w:tcBorders>
               <w:top w:val="single" w:sz="2" w:space="0" w:color="BFBFBF"/>
               <w:bottom w:val="single" w:sz="2" w:space="0" w:color="BFBFBF"/>
@@ -817,6 +1046,7 @@
           <w:p>
             <w:pPr>
               <w:pStyle w:val="Quote"/>
+              <w:spacing w:line="240" w:lineRule="auto"/>
               <w:rPr>
                 <w:rFonts w:cs="Calibri"/>
                 <w:i w:val="0"/>
@@ -833,7 +1063,7 @@
                 <w:sz w:val="20"/>
                 <w:szCs w:val="20"/>
               </w:rPr>
-              <w:t>AI / ML Integration , Model Context Protocol ,</w:t>
+              <w:t>LLM Integrations</w:t>
             </w:r>
             <w:r>
               <w:rPr>
@@ -843,7 +1073,7 @@
                 <w:sz w:val="20"/>
                 <w:szCs w:val="20"/>
               </w:rPr>
-              <w:t xml:space="preserve"> Retrieval-Augmented Generation,</w:t>
+              <w:t xml:space="preserve"> , Model Context Protocol</w:t>
             </w:r>
             <w:r>
               <w:rPr>
@@ -853,7 +1083,7 @@
                 <w:sz w:val="20"/>
                 <w:szCs w:val="20"/>
               </w:rPr>
-              <w:t xml:space="preserve"> LLM </w:t>
+              <w:t>(</w:t>
             </w:r>
             <w:r>
               <w:rPr>
@@ -863,18 +1093,81 @@
                 <w:sz w:val="20"/>
                 <w:szCs w:val="20"/>
               </w:rPr>
-              <w:t>APIs</w:t>
+              <w:t>MCP</w:t>
+            </w:r>
+            <w:r>
+              <w:rPr>
+                <w:rFonts w:cs="Calibri"/>
+                <w:i w:val="0"/>
+                <w:iCs w:val="0"/>
+                <w:sz w:val="20"/>
+                <w:szCs w:val="20"/>
+              </w:rPr>
+              <w:t>)</w:t>
+            </w:r>
+            <w:r>
+              <w:rPr>
+                <w:rFonts w:cs="Calibri"/>
+                <w:i w:val="0"/>
+                <w:iCs w:val="0"/>
+                <w:sz w:val="20"/>
+                <w:szCs w:val="20"/>
+              </w:rPr>
+              <w:t>,</w:t>
+            </w:r>
+            <w:r>
+              <w:rPr>
+                <w:rFonts w:cs="Calibri"/>
+                <w:i w:val="0"/>
+                <w:iCs w:val="0"/>
+                <w:sz w:val="20"/>
+                <w:szCs w:val="20"/>
+              </w:rPr>
+              <w:t xml:space="preserve"> </w:t>
+            </w:r>
+            <w:r>
+              <w:rPr>
+                <w:rFonts w:cs="Calibri"/>
+                <w:i w:val="0"/>
+                <w:iCs w:val="0"/>
+                <w:sz w:val="20"/>
+                <w:szCs w:val="20"/>
+              </w:rPr>
+              <w:br/>
+            </w:r>
+            <w:r>
+              <w:rPr>
+                <w:rFonts w:cs="Calibri"/>
+                <w:i w:val="0"/>
+                <w:iCs w:val="0"/>
+                <w:sz w:val="20"/>
+                <w:szCs w:val="20"/>
+              </w:rPr>
+              <w:t>Retrieval-Augmented Generation</w:t>
+            </w:r>
+            <w:r>
+              <w:rPr>
+                <w:rFonts w:cs="Calibri"/>
+                <w:i w:val="0"/>
+                <w:iCs w:val="0"/>
+                <w:sz w:val="20"/>
+                <w:szCs w:val="20"/>
+              </w:rPr>
+              <w:t xml:space="preserve"> (RAG)</w:t>
             </w:r>
           </w:p>
         </w:tc>
       </w:tr>
       <w:tr>
         <w:trPr>
+          <w:gridAfter w:val="1"/>
+          <w:wAfter w:w="108" w:type="dxa"/>
           <w:trHeight w:val="284"/>
         </w:trPr>
         <w:tc>
           <w:tcPr>
-            <w:tcW w:w="0" w:type="auto"/>
+            <w:tcW w:w="3828" w:type="dxa"/>
+            <w:gridSpan w:val="2"/>
             <w:tcBorders>
               <w:top w:val="single" w:sz="2" w:space="0" w:color="BFBFBF"/>
               <w:bottom w:val="single" w:sz="2" w:space="0" w:color="BFBFBF"/>
@@ -884,6 +1177,7 @@
           <w:p>
             <w:pPr>
               <w:pStyle w:val="Quote"/>
+              <w:spacing w:line="240" w:lineRule="auto"/>
               <w:rPr>
                 <w:rFonts w:cs="Calibri"/>
                 <w:i w:val="0"/>
@@ -908,7 +1202,8 @@
         </w:tc>
         <w:tc>
           <w:tcPr>
-            <w:tcW w:w="0" w:type="auto"/>
+            <w:tcW w:w="6638" w:type="dxa"/>
+            <w:gridSpan w:val="2"/>
             <w:tcBorders>
               <w:top w:val="single" w:sz="2" w:space="0" w:color="BFBFBF"/>
               <w:bottom w:val="single" w:sz="2" w:space="0" w:color="BFBFBF"/>
@@ -917,6 +1212,7 @@
           <w:p>
             <w:pPr>
               <w:pStyle w:val="Quote"/>
+              <w:spacing w:line="240" w:lineRule="auto"/>
               <w:rPr>
                 <w:rFonts w:cs="Calibri"/>
                 <w:i w:val="0"/>
@@ -933,7 +1229,27 @@
                 <w:sz w:val="20"/>
                 <w:szCs w:val="20"/>
               </w:rPr>
-              <w:t>Docker(Containers), Terraform(Infra</w:t>
+              <w:t>Docker(</w:t>
+            </w:r>
+            <w:r>
+              <w:rPr>
+                <w:rFonts w:cs="Calibri"/>
+                <w:i w:val="0"/>
+                <w:iCs w:val="0"/>
+                <w:sz w:val="20"/>
+                <w:szCs w:val="20"/>
+              </w:rPr>
+              <w:t>Containerization</w:t>
+            </w:r>
+            <w:r>
+              <w:rPr>
+                <w:rFonts w:cs="Calibri"/>
+                <w:i w:val="0"/>
+                <w:iCs w:val="0"/>
+                <w:sz w:val="20"/>
+                <w:szCs w:val="20"/>
+              </w:rPr>
+              <w:t>), Terraform(Infra</w:t>
             </w:r>
             <w:r>
               <w:rPr>
@@ -955,16 +1271,29 @@
               </w:rPr>
               <w:t>tructure as Code)</w:t>
             </w:r>
+            <w:r>
+              <w:rPr>
+                <w:rFonts w:cs="Calibri"/>
+                <w:i w:val="0"/>
+                <w:iCs w:val="0"/>
+                <w:sz w:val="20"/>
+                <w:szCs w:val="20"/>
+              </w:rPr>
+              <w:t>, CI/CD, Github Actions, Jenkins</w:t>
+            </w:r>
           </w:p>
         </w:tc>
       </w:tr>
       <w:tr>
         <w:trPr>
+          <w:gridAfter w:val="1"/>
+          <w:wAfter w:w="108" w:type="dxa"/>
           <w:trHeight w:val="284"/>
         </w:trPr>
         <w:tc>
           <w:tcPr>
-            <w:tcW w:w="0" w:type="auto"/>
+            <w:tcW w:w="3828" w:type="dxa"/>
+            <w:gridSpan w:val="2"/>
             <w:tcBorders>
               <w:top w:val="single" w:sz="2" w:space="0" w:color="BFBFBF"/>
               <w:bottom w:val="single" w:sz="2" w:space="0" w:color="BFBFBF"/>
@@ -974,6 +1303,7 @@
           <w:p>
             <w:pPr>
               <w:pStyle w:val="Quote"/>
+              <w:spacing w:line="240" w:lineRule="auto"/>
               <w:rPr>
                 <w:rFonts w:cs="Calibri"/>
                 <w:i w:val="0"/>
@@ -996,7 +1326,8 @@
         </w:tc>
         <w:tc>
           <w:tcPr>
-            <w:tcW w:w="0" w:type="auto"/>
+            <w:tcW w:w="6638" w:type="dxa"/>
+            <w:gridSpan w:val="2"/>
             <w:tcBorders>
               <w:top w:val="single" w:sz="2" w:space="0" w:color="BFBFBF"/>
               <w:bottom w:val="single" w:sz="2" w:space="0" w:color="BFBFBF"/>
@@ -1005,6 +1336,7 @@
           <w:p>
             <w:pPr>
               <w:pStyle w:val="Quote"/>
+              <w:spacing w:line="240" w:lineRule="auto"/>
               <w:rPr>
                 <w:rFonts w:cs="Calibri"/>
                 <w:i w:val="0"/>
@@ -1032,44 +1364,7 @@
                 <w:szCs w:val="20"/>
               </w:rPr>
               <w:br/>
-              <w:t>Relational (Oracle, MySQL)</w:t>
-            </w:r>
-          </w:p>
-        </w:tc>
-      </w:tr>
-      <w:tr>
-        <w:trPr>
-          <w:trHeight w:val="284"/>
-        </w:trPr>
-        <w:tc>
-          <w:tcPr>
-            <w:tcW w:w="0" w:type="auto"/>
-            <w:tcBorders>
-              <w:top w:val="single" w:sz="2" w:space="0" w:color="BFBFBF"/>
-              <w:bottom w:val="single" w:sz="2" w:space="0" w:color="BFBFBF"/>
-            </w:tcBorders>
-            <w:shd w:val="clear" w:color="auto" w:fill="FFFFFF"/>
-          </w:tcPr>
-          <w:p>
-            <w:pPr>
-              <w:pStyle w:val="Quote"/>
-              <w:rPr>
-                <w:rFonts w:cs="Calibri"/>
-                <w:i w:val="0"/>
-                <w:iCs w:val="0"/>
-                <w:sz w:val="20"/>
-                <w:szCs w:val="20"/>
-              </w:rPr>
-            </w:pPr>
-            <w:r>
-              <w:rPr>
-                <w:rFonts w:cs="Calibri"/>
-                <w:i w:val="0"/>
-                <w:iCs w:val="0"/>
-                <w:sz w:val="20"/>
-                <w:szCs w:val="20"/>
-              </w:rPr>
-              <w:t>Version Control</w:t>
+              <w:t xml:space="preserve">Relational </w:t>
             </w:r>
             <w:r>
               <w:rPr>
@@ -1079,38 +1374,7 @@
                 <w:sz w:val="20"/>
                 <w:szCs w:val="20"/>
               </w:rPr>
-              <w:t xml:space="preserve"> &amp; CI/CD</w:t>
-            </w:r>
-          </w:p>
-        </w:tc>
-        <w:tc>
-          <w:tcPr>
-            <w:tcW w:w="0" w:type="auto"/>
-            <w:tcBorders>
-              <w:top w:val="single" w:sz="2" w:space="0" w:color="BFBFBF"/>
-              <w:bottom w:val="single" w:sz="2" w:space="0" w:color="BFBFBF"/>
-            </w:tcBorders>
-          </w:tcPr>
-          <w:p>
-            <w:pPr>
-              <w:pStyle w:val="Quote"/>
-              <w:rPr>
-                <w:rFonts w:cs="Calibri"/>
-                <w:i w:val="0"/>
-                <w:iCs w:val="0"/>
-                <w:sz w:val="20"/>
-                <w:szCs w:val="20"/>
-              </w:rPr>
-            </w:pPr>
-            <w:r>
-              <w:rPr>
-                <w:rFonts w:cs="Calibri"/>
-                <w:i w:val="0"/>
-                <w:iCs w:val="0"/>
-                <w:sz w:val="20"/>
-                <w:szCs w:val="20"/>
-              </w:rPr>
-              <w:t>Git</w:t>
+              <w:t>:</w:t>
             </w:r>
             <w:r>
               <w:rPr>
@@ -1120,18 +1384,21 @@
                 <w:sz w:val="20"/>
                 <w:szCs w:val="20"/>
               </w:rPr>
-              <w:t>, Github Actions, Jenkins</w:t>
+              <w:t>Oracle, MySQL</w:t>
             </w:r>
           </w:p>
         </w:tc>
       </w:tr>
       <w:tr>
         <w:trPr>
+          <w:gridBefore w:val="1"/>
+          <w:wBefore w:w="108" w:type="dxa"/>
           <w:trHeight w:val="284"/>
         </w:trPr>
         <w:tc>
           <w:tcPr>
-            <w:tcW w:w="0" w:type="auto"/>
+            <w:tcW w:w="3828" w:type="dxa"/>
+            <w:gridSpan w:val="2"/>
             <w:tcBorders>
               <w:top w:val="single" w:sz="2" w:space="0" w:color="BFBFBF"/>
               <w:bottom w:val="nil"/>
@@ -1173,7 +1440,8 @@
         </w:tc>
         <w:tc>
           <w:tcPr>
-            <w:tcW w:w="0" w:type="auto"/>
+            <w:tcW w:w="6638" w:type="dxa"/>
+            <w:gridSpan w:val="2"/>
             <w:tcBorders>
               <w:top w:val="single" w:sz="2" w:space="0" w:color="BFBFBF"/>
               <w:bottom w:val="nil"/>
@@ -1765,189 +2033,218 @@
     </w:p>
     <w:p>
       <w:pPr>
-        <w:spacing w:after="0"/>
-        <w:ind w:left="1440"/>
-        <w:rPr>
-          <w:rFonts w:cs="Calibri"/>
-          <w:sz w:val="20"/>
-          <w:szCs w:val="20"/>
-          <w:lang w:val="en-DE"/>
-        </w:rPr>
-      </w:pPr>
-    </w:p>
-    <w:p>
-      <w:pPr>
-        <w:numPr>
-          <w:ilvl w:val="0"/>
-          <w:numId w:val="16"/>
-        </w:numPr>
-        <w:rPr>
-          <w:rFonts w:cs="Calibri"/>
-        </w:rPr>
-      </w:pPr>
-      <w:r>
-        <w:rPr>
-          <w:rFonts w:cs="Calibri"/>
-          <w:b/>
-          <w:sz w:val="20"/>
-          <w:szCs w:val="20"/>
-        </w:rPr>
-        <w:t>Individual Contributor</w:t>
-      </w:r>
-      <w:r>
-        <w:rPr>
-          <w:rFonts w:cs="Calibri"/>
-          <w:szCs w:val="28"/>
-        </w:rPr>
-        <w:t xml:space="preserve"> | </w:t>
-      </w:r>
-      <w:r>
-        <w:rPr>
-          <w:rFonts w:cs="Calibri"/>
-          <w:i/>
-          <w:sz w:val="20"/>
-        </w:rPr>
-        <w:t>08</w:t>
-      </w:r>
-      <w:r>
-        <w:rPr>
-          <w:rFonts w:cs="Calibri"/>
-          <w:i/>
-          <w:sz w:val="20"/>
-        </w:rPr>
-        <w:t xml:space="preserve"> </w:t>
-      </w:r>
-      <w:r>
-        <w:rPr>
-          <w:rFonts w:cs="Calibri"/>
-          <w:i/>
-          <w:sz w:val="20"/>
-        </w:rPr>
-        <w:t>March</w:t>
-      </w:r>
-      <w:r>
-        <w:rPr>
-          <w:rFonts w:cs="Calibri"/>
-          <w:i/>
-          <w:sz w:val="20"/>
-        </w:rPr>
-        <w:t xml:space="preserve"> 201</w:t>
-      </w:r>
-      <w:r>
-        <w:rPr>
-          <w:rFonts w:cs="Calibri"/>
-          <w:i/>
-          <w:sz w:val="20"/>
-        </w:rPr>
-        <w:t>0</w:t>
-      </w:r>
-      <w:r>
-        <w:rPr>
-          <w:rFonts w:cs="Calibri"/>
-          <w:i/>
-          <w:sz w:val="20"/>
-        </w:rPr>
-        <w:t xml:space="preserve"> – </w:t>
-      </w:r>
-      <w:r>
-        <w:rPr>
-          <w:rFonts w:cs="Calibri"/>
-          <w:i/>
-          <w:sz w:val="20"/>
-        </w:rPr>
-        <w:t>0</w:t>
-      </w:r>
-      <w:r>
-        <w:rPr>
-          <w:rFonts w:cs="Calibri"/>
-          <w:i/>
-          <w:sz w:val="20"/>
-        </w:rPr>
-        <w:t xml:space="preserve">6 </w:t>
-      </w:r>
-      <w:r>
-        <w:rPr>
-          <w:rFonts w:cs="Calibri"/>
-          <w:i/>
-          <w:sz w:val="20"/>
-        </w:rPr>
-        <w:t>Jun</w:t>
-      </w:r>
-      <w:r>
-        <w:rPr>
-          <w:rFonts w:cs="Calibri"/>
-          <w:i/>
-          <w:sz w:val="20"/>
-        </w:rPr>
-        <w:t xml:space="preserve"> 201</w:t>
-      </w:r>
-      <w:r>
-        <w:rPr>
-          <w:rFonts w:cs="Calibri"/>
-          <w:i/>
-          <w:sz w:val="20"/>
-        </w:rPr>
-        <w:t>3</w:t>
-      </w:r>
-      <w:r>
-        <w:rPr>
-          <w:rFonts w:cs="Calibri"/>
-        </w:rPr>
-        <w:br/>
-      </w:r>
-      <w:r>
-        <w:rPr>
-          <w:rFonts w:cs="Calibri"/>
-          <w:b/>
-          <w:sz w:val="20"/>
-          <w:szCs w:val="20"/>
-        </w:rPr>
-        <w:t>Oracle Financial Services and Software Solutions, Chennai (India)</w:t>
-      </w:r>
-    </w:p>
-    <w:p>
-      <w:pPr>
+        <w:pStyle w:val="ListParagraph"/>
         <w:numPr>
           <w:ilvl w:val="1"/>
           <w:numId w:val="16"/>
         </w:numPr>
         <w:spacing w:after="0"/>
-        <w:rPr>
-          <w:rFonts w:cs="Calibri"/>
-          <w:sz w:val="20"/>
-          <w:szCs w:val="20"/>
-        </w:rPr>
-      </w:pPr>
-      <w:r>
-        <w:t>Began my professional career as a Business Trainee, building strong foundations in software engineering and domain knowledge</w:t>
+      </w:pPr>
+      <w:r>
+        <w:t>Enabled the portability of the Thing Book application across multiple cloud platforms, including Azure and Pivotal, improving deployment flexibility and platform compatibility</w:t>
       </w:r>
     </w:p>
     <w:p>
       <w:pPr>
+        <w:pStyle w:val="ListParagraph"/>
         <w:numPr>
           <w:ilvl w:val="1"/>
           <w:numId w:val="16"/>
         </w:numPr>
         <w:spacing w:after="0"/>
-        <w:rPr>
-          <w:rFonts w:cs="Calibri"/>
-          <w:sz w:val="20"/>
-          <w:szCs w:val="20"/>
-        </w:rPr>
-      </w:pPr>
-      <w:r>
-        <w:t>Contributed to the development of investment banking products, supporting the delivery of business-critical applications and financial solutions</w:t>
+      </w:pPr>
+      <w:r>
+        <w:t>Performed root cause analysis and implemented a solution to address high memory consumption in the HR solutions, reducing operational costs and improving system availability by preventing frequent outages</w:t>
       </w:r>
     </w:p>
     <w:p>
       <w:pPr>
         <w:spacing w:after="0"/>
-        <w:rPr>
-          <w:rFonts w:cs="Calibri"/>
-          <w:sz w:val="20"/>
-          <w:szCs w:val="20"/>
-        </w:rPr>
-      </w:pPr>
+        <w:ind w:left="1440"/>
+        <w:rPr>
+          <w:rFonts w:cs="Calibri"/>
+          <w:sz w:val="20"/>
+          <w:szCs w:val="20"/>
+          <w:lang w:val="en-DE"/>
+        </w:rPr>
+      </w:pPr>
+    </w:p>
+    <w:p>
+      <w:pPr>
+        <w:numPr>
+          <w:ilvl w:val="0"/>
+          <w:numId w:val="16"/>
+        </w:numPr>
+        <w:rPr>
+          <w:rFonts w:cs="Calibri"/>
+        </w:rPr>
+      </w:pPr>
+      <w:r>
+        <w:rPr>
+          <w:rFonts w:cs="Calibri"/>
+          <w:b/>
+          <w:sz w:val="20"/>
+          <w:szCs w:val="20"/>
+        </w:rPr>
+        <w:t>Individual Contributor</w:t>
+      </w:r>
+      <w:r>
+        <w:rPr>
+          <w:rFonts w:cs="Calibri"/>
+          <w:szCs w:val="28"/>
+        </w:rPr>
+        <w:t xml:space="preserve"> | </w:t>
+      </w:r>
+      <w:r>
+        <w:rPr>
+          <w:rFonts w:cs="Calibri"/>
+          <w:i/>
+          <w:sz w:val="20"/>
+        </w:rPr>
+        <w:t>08</w:t>
+      </w:r>
+      <w:r>
+        <w:rPr>
+          <w:rFonts w:cs="Calibri"/>
+          <w:i/>
+          <w:sz w:val="20"/>
+        </w:rPr>
+        <w:t xml:space="preserve"> </w:t>
+      </w:r>
+      <w:r>
+        <w:rPr>
+          <w:rFonts w:cs="Calibri"/>
+          <w:i/>
+          <w:sz w:val="20"/>
+        </w:rPr>
+        <w:t>March</w:t>
+      </w:r>
+      <w:r>
+        <w:rPr>
+          <w:rFonts w:cs="Calibri"/>
+          <w:i/>
+          <w:sz w:val="20"/>
+        </w:rPr>
+        <w:t xml:space="preserve"> 201</w:t>
+      </w:r>
+      <w:r>
+        <w:rPr>
+          <w:rFonts w:cs="Calibri"/>
+          <w:i/>
+          <w:sz w:val="20"/>
+        </w:rPr>
+        <w:t>0</w:t>
+      </w:r>
+      <w:r>
+        <w:rPr>
+          <w:rFonts w:cs="Calibri"/>
+          <w:i/>
+          <w:sz w:val="20"/>
+        </w:rPr>
+        <w:t xml:space="preserve"> – </w:t>
+      </w:r>
+      <w:r>
+        <w:rPr>
+          <w:rFonts w:cs="Calibri"/>
+          <w:i/>
+          <w:sz w:val="20"/>
+        </w:rPr>
+        <w:t>0</w:t>
+      </w:r>
+      <w:r>
+        <w:rPr>
+          <w:rFonts w:cs="Calibri"/>
+          <w:i/>
+          <w:sz w:val="20"/>
+        </w:rPr>
+        <w:t xml:space="preserve">6 </w:t>
+      </w:r>
+      <w:r>
+        <w:rPr>
+          <w:rFonts w:cs="Calibri"/>
+          <w:i/>
+          <w:sz w:val="20"/>
+        </w:rPr>
+        <w:t>Jun</w:t>
+      </w:r>
+      <w:r>
+        <w:rPr>
+          <w:rFonts w:cs="Calibri"/>
+          <w:i/>
+          <w:sz w:val="20"/>
+        </w:rPr>
+        <w:t xml:space="preserve"> 201</w:t>
+      </w:r>
+      <w:r>
+        <w:rPr>
+          <w:rFonts w:cs="Calibri"/>
+          <w:i/>
+          <w:sz w:val="20"/>
+        </w:rPr>
+        <w:t>3</w:t>
+      </w:r>
+      <w:r>
+        <w:rPr>
+          <w:rFonts w:cs="Calibri"/>
+        </w:rPr>
+        <w:br/>
+      </w:r>
+      <w:r>
+        <w:rPr>
+          <w:rFonts w:cs="Calibri"/>
+          <w:b/>
+          <w:sz w:val="20"/>
+          <w:szCs w:val="20"/>
+        </w:rPr>
+        <w:t>Oracle Financial Services and Software Solutions, Chennai (India)</w:t>
+      </w:r>
+    </w:p>
+    <w:p>
+      <w:pPr>
+        <w:numPr>
+          <w:ilvl w:val="1"/>
+          <w:numId w:val="16"/>
+        </w:numPr>
+        <w:spacing w:after="0"/>
+        <w:rPr>
+          <w:rFonts w:cs="Calibri"/>
+          <w:sz w:val="20"/>
+          <w:szCs w:val="20"/>
+        </w:rPr>
+      </w:pPr>
+      <w:r>
+        <w:t>Began my professional career as a Business Trainee, building strong foundations in software engineering and domain knowledge</w:t>
+      </w:r>
+    </w:p>
+    <w:p>
+      <w:pPr>
+        <w:numPr>
+          <w:ilvl w:val="1"/>
+          <w:numId w:val="16"/>
+        </w:numPr>
+        <w:spacing w:after="0"/>
+        <w:rPr>
+          <w:rFonts w:cs="Calibri"/>
+          <w:sz w:val="20"/>
+          <w:szCs w:val="20"/>
+        </w:rPr>
+      </w:pPr>
+      <w:r>
+        <w:t>Contributed to the development of investment banking products, supporting the delivery of business-critical applications and financial solutions</w:t>
+      </w:r>
+    </w:p>
+    <w:p>
+      <w:pPr>
+        <w:pStyle w:val="ListParagraph"/>
+        <w:numPr>
+          <w:ilvl w:val="1"/>
+          <w:numId w:val="16"/>
+        </w:numPr>
+        <w:spacing w:after="0"/>
+      </w:pPr>
+      <w:r>
+        <w:t>Successfully owned and delivered the end-to-end development of the OTC (Over-the-Counter) module from the ground up for the TPS product</w:t>
+      </w:r>
     </w:p>
     <w:p>
       <w:pPr>
@@ -2170,14 +2467,6 @@
     </w:p>
     <w:p>
       <w:pPr>
-        <w:spacing w:after="0"/>
-        <w:rPr>
-          <w:rFonts w:cs="Calibri"/>
-        </w:rPr>
-      </w:pPr>
-    </w:p>
-    <w:p>
-      <w:pPr>
         <w:pStyle w:val="ECVText"/>
         <w:spacing w:before="4" w:after="8"/>
         <w:rPr>
@@ -2323,45 +2612,6 @@
         <w:pStyle w:val="ListParagraph"/>
         <w:numPr>
           <w:ilvl w:val="0"/>
-          <w:numId w:val="32"/>
-        </w:numPr>
-        <w:spacing w:after="0"/>
-      </w:pPr>
-      <w:r>
-        <w:t>Successfully owned and delivered the end-to-end development of the OTC (Over-the-Counter) module from the ground up for the TPS product</w:t>
-      </w:r>
-    </w:p>
-    <w:p>
-      <w:pPr>
-        <w:pStyle w:val="ListParagraph"/>
-        <w:numPr>
-          <w:ilvl w:val="0"/>
-          <w:numId w:val="33"/>
-        </w:numPr>
-        <w:spacing w:after="0"/>
-      </w:pPr>
-      <w:r>
-        <w:t>Performed root cause analysis and implemented a solution to address high memory consumption in the MyHR application, reducing operational costs and improving system availability by preventing frequent outages</w:t>
-      </w:r>
-    </w:p>
-    <w:p>
-      <w:pPr>
-        <w:pStyle w:val="ListParagraph"/>
-        <w:numPr>
-          <w:ilvl w:val="0"/>
-          <w:numId w:val="33"/>
-        </w:numPr>
-        <w:spacing w:after="0"/>
-      </w:pPr>
-      <w:r>
-        <w:t>Enabled the portability of the Thing Book application across multiple cloud platforms, including Azure and Pivotal, improving deployment flexibility and platform compatibility</w:t>
-      </w:r>
-    </w:p>
-    <w:p>
-      <w:pPr>
-        <w:pStyle w:val="ListParagraph"/>
-        <w:numPr>
-          <w:ilvl w:val="0"/>
           <w:numId w:val="33"/>
         </w:numPr>
         <w:spacing w:after="0"/>
@@ -2508,7 +2758,7 @@
           <w:sz w:val="20"/>
           <w:szCs w:val="20"/>
         </w:rPr>
-        <w:t xml:space="preserve">by Bosch India </w:t>
+        <w:t xml:space="preserve">by Bosch </w:t>
       </w:r>
       <w:r>
         <w:rPr>
@@ -2518,7 +2768,7 @@
           <w:sz w:val="20"/>
           <w:szCs w:val="20"/>
         </w:rPr>
-        <w:t xml:space="preserve"> in Thing Book product for successful implementation </w:t>
+        <w:t xml:space="preserve">in Thing Book product for successful implementation </w:t>
       </w:r>
     </w:p>
     <w:p>
@@ -2545,8 +2795,52 @@
           <w:sz w:val="20"/>
           <w:szCs w:val="20"/>
         </w:rPr>
-        <w:t>Best Team award from Sony India in the year 2016 for successful migration of Garata Suite</w:t>
-      </w:r>
+        <w:t xml:space="preserve">Best Team award from Sony </w:t>
+      </w:r>
+      <w:r>
+        <w:rPr>
+          <w:rFonts w:ascii="Calibri" w:hAnsi="Calibri" w:cs="Calibri"/>
+          <w:color w:val="auto"/>
+          <w:spacing w:val="0"/>
+          <w:sz w:val="20"/>
+          <w:szCs w:val="20"/>
+        </w:rPr>
+        <w:t xml:space="preserve">Software Development centre </w:t>
+      </w:r>
+      <w:r>
+        <w:rPr>
+          <w:rFonts w:ascii="Calibri" w:hAnsi="Calibri" w:cs="Calibri"/>
+          <w:color w:val="auto"/>
+          <w:spacing w:val="0"/>
+          <w:sz w:val="20"/>
+          <w:szCs w:val="20"/>
+        </w:rPr>
+        <w:t xml:space="preserve">in the year 2016 for successful migration of </w:t>
+      </w:r>
+      <w:r>
+        <w:rPr>
+          <w:rFonts w:ascii="Calibri" w:hAnsi="Calibri" w:cs="Calibri"/>
+          <w:color w:val="auto"/>
+          <w:spacing w:val="0"/>
+          <w:sz w:val="20"/>
+          <w:szCs w:val="20"/>
+        </w:rPr>
+        <w:t>VAIO apps</w:t>
+      </w:r>
+    </w:p>
+    <w:p>
+      <w:pPr>
+        <w:pStyle w:val="europass5fbulleted5flist"/>
+        <w:spacing w:before="4" w:after="8"/>
+        <w:ind w:left="720"/>
+        <w:rPr>
+          <w:rFonts w:ascii="Calibri" w:hAnsi="Calibri" w:cs="Calibri"/>
+          <w:color w:val="auto"/>
+          <w:spacing w:val="0"/>
+          <w:sz w:val="20"/>
+          <w:szCs w:val="20"/>
+        </w:rPr>
+      </w:pPr>
     </w:p>
     <w:p>
       <w:pPr>
@@ -2592,6 +2886,7 @@
           <w:color w:val="0070C0"/>
           <w:sz w:val="24"/>
         </w:rPr>
+        <w:lastRenderedPageBreak/>
         <mc:AlternateContent>
           <mc:Choice Requires="wps">
             <w:drawing>
@@ -5131,6 +5426,7 @@
           <w:sz w:val="20"/>
           <w:szCs w:val="20"/>
         </w:rPr>
+        <w:lastRenderedPageBreak/>
         <w:t>9</w:t>
       </w:r>
       <w:r>
@@ -5852,10 +6148,9 @@
       </w:numPr>
       <w:spacing w:before="0" w:after="0"/>
       <w:rPr>
+        <w:rStyle w:val="BookTitle"/>
         <w:i/>
-        <w:smallCaps w:val="0"/>
-        <w:spacing w:val="5"/>
-        <w:lang w:val="de-DE"/>
+        <w:lang w:val="en-GB"/>
       </w:rPr>
     </w:pPr>
     <w:r>
@@ -5872,22 +6167,17 @@
       </w:rPr>
       <w:br/>
     </w:r>
-  </w:p>
-  <w:p>
-    <w:pPr>
-      <w:pStyle w:val="Heading1"/>
-      <w:numPr>
-        <w:ilvl w:val="0"/>
-        <w:numId w:val="0"/>
-      </w:numPr>
-      <w:spacing w:before="0" w:after="0"/>
+    <w:r>
       <w:rPr>
         <w:rStyle w:val="BookTitle"/>
         <w:rFonts w:asciiTheme="minorHAnsi" w:hAnsiTheme="minorHAnsi" w:cstheme="minorHAnsi"/>
-        <w:i/>
+        <w:b w:val="0"/>
+        <w:sz w:val="40"/>
+        <w:szCs w:val="40"/>
         <w:lang w:val="en-GB"/>
       </w:rPr>
-    </w:pPr>
+      <w:br/>
+    </w:r>
     <w:r>
       <w:rPr>
         <w:rStyle w:val="BookTitle"/>
@@ -5912,8 +6202,8 @@
         <w:rStyle w:val="BookTitle"/>
         <w:rFonts w:asciiTheme="minorHAnsi" w:hAnsiTheme="minorHAnsi" w:cstheme="minorHAnsi"/>
         <w:b w:val="0"/>
-        <w:sz w:val="28"/>
-        <w:szCs w:val="28"/>
+        <w:sz w:val="24"/>
+        <w:szCs w:val="24"/>
         <w:lang w:val="en-GB"/>
       </w:rPr>
     </w:pPr>
@@ -5922,8 +6212,8 @@
         <w:rStyle w:val="BookTitle"/>
         <w:rFonts w:asciiTheme="minorHAnsi" w:hAnsiTheme="minorHAnsi" w:cstheme="minorHAnsi"/>
         <w:b w:val="0"/>
-        <w:sz w:val="28"/>
-        <w:szCs w:val="28"/>
+        <w:sz w:val="24"/>
+        <w:szCs w:val="24"/>
         <w:lang w:val="en-GB"/>
       </w:rPr>
       <w:t xml:space="preserve">Senior </w:t>
@@ -5933,8 +6223,8 @@
         <w:rStyle w:val="BookTitle"/>
         <w:rFonts w:asciiTheme="minorHAnsi" w:hAnsiTheme="minorHAnsi" w:cstheme="minorHAnsi"/>
         <w:b w:val="0"/>
-        <w:sz w:val="28"/>
-        <w:szCs w:val="28"/>
+        <w:sz w:val="24"/>
+        <w:szCs w:val="24"/>
         <w:lang w:val="en-GB"/>
       </w:rPr>
       <w:t xml:space="preserve">Software Engineer </w:t>
@@ -5944,8 +6234,8 @@
         <w:rStyle w:val="BookTitle"/>
         <w:rFonts w:asciiTheme="minorHAnsi" w:hAnsiTheme="minorHAnsi" w:cstheme="minorHAnsi"/>
         <w:b w:val="0"/>
-        <w:sz w:val="28"/>
-        <w:szCs w:val="28"/>
+        <w:sz w:val="24"/>
+        <w:szCs w:val="24"/>
         <w:lang w:val="en-GB"/>
       </w:rPr>
       <w:t>–</w:t>
@@ -5955,8 +6245,8 @@
         <w:rStyle w:val="BookTitle"/>
         <w:rFonts w:asciiTheme="minorHAnsi" w:hAnsiTheme="minorHAnsi" w:cstheme="minorHAnsi"/>
         <w:b w:val="0"/>
-        <w:sz w:val="28"/>
-        <w:szCs w:val="28"/>
+        <w:sz w:val="24"/>
+        <w:szCs w:val="24"/>
         <w:lang w:val="en-GB"/>
       </w:rPr>
       <w:t xml:space="preserve"> </w:t>
@@ -5966,8 +6256,8 @@
         <w:rStyle w:val="BookTitle"/>
         <w:rFonts w:asciiTheme="minorHAnsi" w:hAnsiTheme="minorHAnsi" w:cstheme="minorHAnsi"/>
         <w:b w:val="0"/>
-        <w:sz w:val="28"/>
-        <w:szCs w:val="28"/>
+        <w:sz w:val="24"/>
+        <w:szCs w:val="24"/>
         <w:lang w:val="en-GB"/>
       </w:rPr>
       <w:t xml:space="preserve">System </w:t>
@@ -5977,8 +6267,8 @@
         <w:rStyle w:val="BookTitle"/>
         <w:rFonts w:asciiTheme="minorHAnsi" w:hAnsiTheme="minorHAnsi" w:cstheme="minorHAnsi"/>
         <w:b w:val="0"/>
-        <w:sz w:val="28"/>
-        <w:szCs w:val="28"/>
+        <w:sz w:val="24"/>
+        <w:szCs w:val="24"/>
         <w:lang w:val="en-GB"/>
       </w:rPr>
       <w:t>Design</w:t>
@@ -5988,77 +6278,66 @@
         <w:rStyle w:val="BookTitle"/>
         <w:rFonts w:asciiTheme="minorHAnsi" w:hAnsiTheme="minorHAnsi" w:cstheme="minorHAnsi"/>
         <w:b w:val="0"/>
-        <w:sz w:val="28"/>
-        <w:szCs w:val="28"/>
+        <w:sz w:val="24"/>
+        <w:szCs w:val="24"/>
         <w:lang w:val="en-GB"/>
       </w:rPr>
-      <w:t xml:space="preserve"> | </w:t>
+      <w:t xml:space="preserve"> </w:t>
     </w:r>
     <w:r>
       <w:rPr>
         <w:rStyle w:val="BookTitle"/>
         <w:rFonts w:asciiTheme="minorHAnsi" w:hAnsiTheme="minorHAnsi" w:cstheme="minorHAnsi"/>
         <w:b w:val="0"/>
-        <w:sz w:val="28"/>
-        <w:szCs w:val="28"/>
+        <w:sz w:val="24"/>
+        <w:szCs w:val="24"/>
         <w:lang w:val="en-GB"/>
       </w:rPr>
-      <w:t>Web</w:t>
+      <w:t>|</w:t>
     </w:r>
     <w:r>
       <w:rPr>
         <w:rStyle w:val="BookTitle"/>
         <w:rFonts w:asciiTheme="minorHAnsi" w:hAnsiTheme="minorHAnsi" w:cstheme="minorHAnsi"/>
         <w:b w:val="0"/>
-        <w:sz w:val="28"/>
-        <w:szCs w:val="28"/>
+        <w:sz w:val="24"/>
+        <w:szCs w:val="24"/>
         <w:lang w:val="en-GB"/>
       </w:rPr>
-      <w:t xml:space="preserve"> </w:t>
+      <w:t xml:space="preserve"> Web &amp;</w:t>
     </w:r>
     <w:r>
       <w:rPr>
         <w:rStyle w:val="BookTitle"/>
         <w:rFonts w:asciiTheme="minorHAnsi" w:hAnsiTheme="minorHAnsi" w:cstheme="minorHAnsi"/>
         <w:b w:val="0"/>
-        <w:sz w:val="28"/>
-        <w:szCs w:val="28"/>
+        <w:sz w:val="24"/>
+        <w:szCs w:val="24"/>
         <w:lang w:val="en-GB"/>
       </w:rPr>
-      <w:t>Apps</w:t>
+      <w:t xml:space="preserve"> Cloud Native </w:t>
     </w:r>
     <w:r>
       <w:rPr>
         <w:rStyle w:val="BookTitle"/>
         <w:rFonts w:asciiTheme="minorHAnsi" w:hAnsiTheme="minorHAnsi" w:cstheme="minorHAnsi"/>
         <w:b w:val="0"/>
-        <w:sz w:val="28"/>
-        <w:szCs w:val="28"/>
+        <w:sz w:val="24"/>
+        <w:szCs w:val="24"/>
         <w:lang w:val="en-GB"/>
       </w:rPr>
-      <w:t xml:space="preserve"> | Cloud Native Apps | </w:t>
+      <w:t>Applications</w:t>
     </w:r>
     <w:r>
       <w:rPr>
         <w:rStyle w:val="BookTitle"/>
         <w:rFonts w:asciiTheme="minorHAnsi" w:hAnsiTheme="minorHAnsi" w:cstheme="minorHAnsi"/>
         <w:b w:val="0"/>
-        <w:sz w:val="28"/>
-        <w:szCs w:val="28"/>
+        <w:sz w:val="24"/>
+        <w:szCs w:val="24"/>
         <w:lang w:val="en-GB"/>
       </w:rPr>
-      <w:br/>
-    </w:r>
-    <w:r>
-      <w:rPr>
-        <w:rStyle w:val="BookTitle"/>
-        <w:rFonts w:asciiTheme="minorHAnsi" w:hAnsiTheme="minorHAnsi" w:cstheme="minorHAnsi"/>
-        <w:b w:val="0"/>
-        <w:sz w:val="28"/>
-        <w:szCs w:val="28"/>
-        <w:lang w:val="en-GB"/>
-      </w:rPr>
-      <w:t>AI/ML Integration</w:t>
+      <w:t xml:space="preserve"> | AI/ML Integration</w:t>
     </w:r>
   </w:p>
   <w:p>
@@ -6094,6 +6373,34 @@
         <w:lang w:val="en-GB"/>
       </w:rPr>
     </w:pPr>
+    <w:r>
+      <w:rPr>
+        <w:rFonts w:ascii="Apple Color Emoji" w:eastAsia="Times New Roman" w:hAnsi="Apple Color Emoji" w:cs="Apple Color Emoji"/>
+        <w:b w:val="0"/>
+        <w:bCs w:val="0"/>
+        <w:i/>
+        <w:iCs/>
+        <w:smallCaps w:val="0"/>
+        <w:color w:val="auto"/>
+        <w:sz w:val="21"/>
+        <w:szCs w:val="21"/>
+      </w:rPr>
+      <w:t>🎓</w:t>
+    </w:r>
+    <w:r>
+      <w:rPr>
+        <w:rFonts w:asciiTheme="minorHAnsi" w:eastAsia="Times New Roman" w:hAnsiTheme="minorHAnsi" w:cstheme="minorHAnsi"/>
+        <w:b w:val="0"/>
+        <w:bCs w:val="0"/>
+        <w:i/>
+        <w:iCs/>
+        <w:smallCaps w:val="0"/>
+        <w:color w:val="auto"/>
+        <w:sz w:val="21"/>
+        <w:szCs w:val="21"/>
+      </w:rPr>
+      <w:t>Graduation : Bachelor of Instrumentation and Control Engineering</w:t>
+    </w:r>
     <w:r>
       <w:rPr>
         <w:rFonts w:asciiTheme="minorHAnsi" w:hAnsiTheme="minorHAnsi" w:cstheme="minorHAnsi"/>
@@ -6410,19 +6717,6 @@
         <w:lang w:val="en-GB"/>
       </w:rPr>
       <w:t>Languages: English (Fluent/C1), German (Basic/A2 – actively learning)</w:t>
-    </w:r>
-    <w:r>
-      <w:rPr>
-        <w:rStyle w:val="BookTitle"/>
-        <w:rFonts w:ascii="Calibri" w:hAnsi="Calibri" w:cs="Calibri"/>
-        <w:b w:val="0"/>
-        <w:bCs w:val="0"/>
-        <w:i/>
-        <w:sz w:val="21"/>
-        <w:szCs w:val="21"/>
-        <w:lang w:val="en-GB"/>
-      </w:rPr>
-      <w:br/>
     </w:r>
   </w:p>
 </w:hdr>

</xml_diff>

<commit_message>
Added space in Header
</commit_message>
<xml_diff>
--- a/AJAYKUMAR_DHANDAPANI.docx
+++ b/AJAYKUMAR_DHANDAPANI.docx
@@ -6718,6 +6718,20 @@
       </w:rPr>
       <w:t>Languages: English (Fluent/C1), German (Basic/A2 – actively learning)</w:t>
     </w:r>
+    <w:r>
+      <w:rPr>
+        <w:rStyle w:val="BookTitle"/>
+        <w:rFonts w:asciiTheme="minorHAnsi" w:hAnsiTheme="minorHAnsi" w:cstheme="minorHAnsi"/>
+        <w:b w:val="0"/>
+        <w:bCs w:val="0"/>
+        <w:i/>
+        <w:iCs/>
+        <w:sz w:val="21"/>
+        <w:szCs w:val="21"/>
+        <w:lang w:val="en-GB"/>
+      </w:rPr>
+      <w:br/>
+    </w:r>
   </w:p>
 </w:hdr>
 </file>

</xml_diff>

<commit_message>
Added Unicode Emoji for visual appeal
</commit_message>
<xml_diff>
--- a/AJAYKUMAR_DHANDAPANI.docx
+++ b/AJAYKUMAR_DHANDAPANI.docx
@@ -16,40 +16,35 @@
       </w:pPr>
       <w:r>
         <w:rPr>
-          <w:rFonts w:ascii="Arial Nova" w:hAnsi="Arial Nova"/>
+          <w:rFonts w:ascii="Apple Color Emoji" w:hAnsi="Apple Color Emoji" w:cs="Apple Color Emoji"/>
           <w:noProof/>
-          <w:color w:val="0070C0"/>
           <w:sz w:val="24"/>
           <w:szCs w:val="24"/>
         </w:rPr>
         <mc:AlternateContent>
           <mc:Choice Requires="wps">
             <w:drawing>
-              <wp:anchor distT="0" distB="0" distL="114300" distR="114300" simplePos="0" relativeHeight="251663872" behindDoc="0" locked="0" layoutInCell="1" allowOverlap="1" wp14:anchorId="3D6BA055" wp14:editId="6931D2A0">
+              <wp:anchor distT="0" distB="0" distL="114300" distR="114300" simplePos="0" relativeHeight="251668992" behindDoc="0" locked="0" layoutInCell="1" allowOverlap="1" wp14:anchorId="4FC00926" wp14:editId="6EB8C52A">
                 <wp:simplePos x="0" y="0"/>
                 <wp:positionH relativeFrom="column">
-                  <wp:posOffset>647700</wp:posOffset>
+                  <wp:posOffset>749935</wp:posOffset>
                 </wp:positionH>
-                <wp:positionV relativeFrom="line">
-                  <wp:posOffset>144780</wp:posOffset>
+                <wp:positionV relativeFrom="paragraph">
+                  <wp:posOffset>155720</wp:posOffset>
                 </wp:positionV>
-                <wp:extent cx="5958205" cy="0"/>
-                <wp:effectExtent l="0" t="63500" r="61595" b="63500"/>
+                <wp:extent cx="5903651" cy="0"/>
+                <wp:effectExtent l="0" t="63500" r="78105" b="76200"/>
                 <wp:wrapNone/>
-                <wp:docPr id="641693588" name="AutoShape 16"/>
-                <wp:cNvGraphicFramePr>
-                  <a:graphicFrameLocks xmlns:a="http://schemas.openxmlformats.org/drawingml/2006/main"/>
-                </wp:cNvGraphicFramePr>
+                <wp:docPr id="1813471717" name="Straight Arrow Connector 16"/>
+                <wp:cNvGraphicFramePr/>
                 <a:graphic xmlns:a="http://schemas.openxmlformats.org/drawingml/2006/main">
                   <a:graphicData uri="http://schemas.microsoft.com/office/word/2010/wordprocessingShape">
                     <wps:wsp>
-                      <wps:cNvCnPr>
-                        <a:cxnSpLocks/>
-                      </wps:cNvCnPr>
-                      <wps:spPr bwMode="auto">
+                      <wps:cNvCnPr/>
+                      <wps:spPr>
                         <a:xfrm>
                           <a:off x="0" y="0"/>
-                          <a:ext cx="5958205" cy="0"/>
+                          <a:ext cx="5903651" cy="0"/>
                         </a:xfrm>
                         <a:prstGeom prst="straightConnector1">
                           <a:avLst/>
@@ -75,10 +70,10 @@
                     </wps:wsp>
                   </a:graphicData>
                 </a:graphic>
-                <wp14:sizeRelH relativeFrom="page">
+                <wp14:sizeRelH relativeFrom="margin">
                   <wp14:pctWidth>0</wp14:pctWidth>
                 </wp14:sizeRelH>
-                <wp14:sizeRelV relativeFrom="page">
+                <wp14:sizeRelV relativeFrom="margin">
                   <wp14:pctHeight>0</wp14:pctHeight>
                 </wp14:sizeRelV>
               </wp:anchor>
@@ -86,18 +81,32 @@
           </mc:Choice>
           <mc:Fallback>
             <w:pict>
-              <v:shapetype w14:anchorId="3E1FDFE8" id="_x0000_t32" coordsize="21600,21600" o:spt="32" o:oned="t" path="m,l21600,21600e" filled="f">
+              <v:shapetype w14:anchorId="22464B3B" id="_x0000_t32" coordsize="21600,21600" o:spt="32" o:oned="t" path="m,l21600,21600e" filled="f">
                 <v:path arrowok="t" fillok="f" o:connecttype="none"/>
                 <o:lock v:ext="edit" shapetype="t"/>
               </v:shapetype>
-              <v:shape id="AutoShape 16" o:spid="_x0000_s1026" type="#_x0000_t32" style="position:absolute;margin-left:51pt;margin-top:11.4pt;width:469.15pt;height:0;z-index:251663872;visibility:visible;mso-wrap-style:square;mso-width-percent:0;mso-height-percent:0;mso-wrap-distance-left:9pt;mso-wrap-distance-top:0;mso-wrap-distance-right:9pt;mso-wrap-distance-bottom:0;mso-position-horizontal:absolute;mso-position-horizontal-relative:text;mso-position-vertical:absolute;mso-position-vertical-relative:line;mso-width-percent:0;mso-height-percent:0;mso-width-relative:page;mso-height-relative:page" o:gfxdata="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" strokecolor="#7f7f7f">
+              <v:shape id="Straight Arrow Connector 16" o:spid="_x0000_s1026" type="#_x0000_t32" style="position:absolute;margin-left:59.05pt;margin-top:12.25pt;width:464.85pt;height:0;z-index:251668992;visibility:visible;mso-wrap-style:square;mso-width-percent:0;mso-height-percent:0;mso-wrap-distance-left:9pt;mso-wrap-distance-top:0;mso-wrap-distance-right:9pt;mso-wrap-distance-bottom:0;mso-position-horizontal:absolute;mso-position-horizontal-relative:text;mso-position-vertical:absolute;mso-position-vertical-relative:text;mso-width-percent:0;mso-height-percent:0;mso-width-relative:margin;mso-height-relative:margin" o:gfxdata="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" strokecolor="#7f7f7f">
                 <v:stroke endarrow="diamond" endarrowwidth="wide" endarrowlength="long"/>
-                <o:lock v:ext="edit" shapetype="f"/>
-                <w10:wrap anchory="line"/>
               </v:shape>
             </w:pict>
           </mc:Fallback>
         </mc:AlternateContent>
+      </w:r>
+      <w:r>
+        <w:rPr>
+          <w:rFonts w:ascii="Apple Color Emoji" w:hAnsi="Apple Color Emoji" w:cs="Apple Color Emoji"/>
+          <w:sz w:val="24"/>
+          <w:szCs w:val="24"/>
+        </w:rPr>
+        <w:t>👤</w:t>
+      </w:r>
+      <w:r>
+        <w:rPr>
+          <w:rFonts w:cs="Calibri"/>
+          <w:sz w:val="24"/>
+          <w:szCs w:val="24"/>
+        </w:rPr>
+        <w:t xml:space="preserve"> </w:t>
       </w:r>
       <w:r>
         <w:rPr>
@@ -222,10 +231,7 @@
         <w:t xml:space="preserve"> and </w:t>
       </w:r>
       <w:r>
-        <w:t>p</w:t>
-      </w:r>
-      <w:r>
-        <w:t>roactively volunteered for complex technical challenges</w:t>
+        <w:t>proactively volunteered complex technical challenges</w:t>
       </w:r>
     </w:p>
     <w:p>
@@ -288,7 +294,7 @@
       </w:pPr>
       <w:r>
         <w:rPr>
-          <w:rFonts w:ascii="Arial Nova" w:hAnsi="Arial Nova"/>
+          <w:rFonts w:cs="Calibri"/>
           <w:noProof/>
           <w:color w:val="0070C0"/>
           <w:sz w:val="24"/>
@@ -297,31 +303,27 @@
         <mc:AlternateContent>
           <mc:Choice Requires="wps">
             <w:drawing>
-              <wp:anchor distT="0" distB="0" distL="114300" distR="114300" simplePos="0" relativeHeight="251664896" behindDoc="0" locked="0" layoutInCell="1" allowOverlap="1" wp14:anchorId="2CAA3251" wp14:editId="5983D128">
+              <wp:anchor distT="0" distB="0" distL="114300" distR="114300" simplePos="0" relativeHeight="251667968" behindDoc="0" locked="0" layoutInCell="1" allowOverlap="1" wp14:anchorId="0550CB27" wp14:editId="026D4BCA">
                 <wp:simplePos x="0" y="0"/>
                 <wp:positionH relativeFrom="column">
-                  <wp:posOffset>1211580</wp:posOffset>
+                  <wp:posOffset>1348451</wp:posOffset>
                 </wp:positionH>
-                <wp:positionV relativeFrom="line">
-                  <wp:posOffset>150495</wp:posOffset>
+                <wp:positionV relativeFrom="paragraph">
+                  <wp:posOffset>156580</wp:posOffset>
                 </wp:positionV>
-                <wp:extent cx="5393690" cy="0"/>
-                <wp:effectExtent l="0" t="63500" r="67310" b="63500"/>
+                <wp:extent cx="5301711" cy="0"/>
+                <wp:effectExtent l="0" t="63500" r="70485" b="76200"/>
                 <wp:wrapNone/>
-                <wp:docPr id="110920553" name="AutoShape 15"/>
-                <wp:cNvGraphicFramePr>
-                  <a:graphicFrameLocks xmlns:a="http://schemas.openxmlformats.org/drawingml/2006/main"/>
-                </wp:cNvGraphicFramePr>
+                <wp:docPr id="1487518224" name="Straight Arrow Connector 14"/>
+                <wp:cNvGraphicFramePr/>
                 <a:graphic xmlns:a="http://schemas.openxmlformats.org/drawingml/2006/main">
                   <a:graphicData uri="http://schemas.microsoft.com/office/word/2010/wordprocessingShape">
                     <wps:wsp>
-                      <wps:cNvCnPr>
-                        <a:cxnSpLocks/>
-                      </wps:cNvCnPr>
-                      <wps:spPr bwMode="auto">
+                      <wps:cNvCnPr/>
+                      <wps:spPr>
                         <a:xfrm>
                           <a:off x="0" y="0"/>
-                          <a:ext cx="5393690" cy="0"/>
+                          <a:ext cx="5301711" cy="0"/>
                         </a:xfrm>
                         <a:prstGeom prst="straightConnector1">
                           <a:avLst/>
@@ -347,25 +349,42 @@
                     </wps:wsp>
                   </a:graphicData>
                 </a:graphic>
-                <wp14:sizeRelH relativeFrom="page">
+                <wp14:sizeRelH relativeFrom="margin">
                   <wp14:pctWidth>0</wp14:pctWidth>
                 </wp14:sizeRelH>
-                <wp14:sizeRelV relativeFrom="page">
-                  <wp14:pctHeight>0</wp14:pctHeight>
-                </wp14:sizeRelV>
               </wp:anchor>
             </w:drawing>
           </mc:Choice>
           <mc:Fallback>
             <w:pict>
-              <v:shape w14:anchorId="6FB597B0" id="AutoShape 15" o:spid="_x0000_s1026" type="#_x0000_t32" style="position:absolute;margin-left:95.4pt;margin-top:11.85pt;width:424.7pt;height:0;z-index:251664896;visibility:visible;mso-wrap-style:square;mso-width-percent:0;mso-height-percent:0;mso-wrap-distance-left:9pt;mso-wrap-distance-top:0;mso-wrap-distance-right:9pt;mso-wrap-distance-bottom:0;mso-position-horizontal:absolute;mso-position-horizontal-relative:text;mso-position-vertical:absolute;mso-position-vertical-relative:line;mso-width-percent:0;mso-height-percent:0;mso-width-relative:page;mso-height-relative:page" o:gfxdata="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" strokecolor="#7f7f7f">
+              <v:shape w14:anchorId="128C4C81" id="Straight Arrow Connector 14" o:spid="_x0000_s1026" type="#_x0000_t32" style="position:absolute;margin-left:106.2pt;margin-top:12.35pt;width:417.45pt;height:0;z-index:251667968;visibility:visible;mso-wrap-style:square;mso-width-percent:0;mso-wrap-distance-left:9pt;mso-wrap-distance-top:0;mso-wrap-distance-right:9pt;mso-wrap-distance-bottom:0;mso-position-horizontal:absolute;mso-position-horizontal-relative:text;mso-position-vertical:absolute;mso-position-vertical-relative:text;mso-width-percent:0;mso-width-relative:margin" o:gfxdata="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" strokecolor="#7f7f7f">
                 <v:stroke endarrow="diamond" endarrowwidth="wide" endarrowlength="long"/>
-                <o:lock v:ext="edit" shapetype="f"/>
-                <w10:wrap anchory="line"/>
               </v:shape>
             </w:pict>
           </mc:Fallback>
         </mc:AlternateContent>
+      </w:r>
+      <w:r>
+        <w:rPr>
+          <w:rFonts w:ascii="Apple Color Emoji" w:hAnsi="Apple Color Emoji" w:cs="Apple Color Emoji"/>
+          <w:b/>
+          <w:bCs/>
+          <w:color w:val="0070C0"/>
+          <w:sz w:val="24"/>
+          <w:szCs w:val="24"/>
+        </w:rPr>
+        <w:t>🧠</w:t>
+      </w:r>
+      <w:r>
+        <w:rPr>
+          <w:rFonts w:cs="Calibri"/>
+          <w:b/>
+          <w:bCs/>
+          <w:color w:val="0070C0"/>
+          <w:sz w:val="24"/>
+          <w:szCs w:val="24"/>
+        </w:rPr>
+        <w:t xml:space="preserve"> </w:t>
       </w:r>
       <w:r>
         <w:rPr>
@@ -840,7 +859,27 @@
                 <w:sz w:val="20"/>
                 <w:szCs w:val="20"/>
               </w:rPr>
-              <w:t xml:space="preserve">Event Drive Architecture, </w:t>
+              <w:t>Event Drive</w:t>
+            </w:r>
+            <w:r>
+              <w:rPr>
+                <w:rFonts w:cs="Calibri"/>
+                <w:i w:val="0"/>
+                <w:iCs w:val="0"/>
+                <w:sz w:val="20"/>
+                <w:szCs w:val="20"/>
+              </w:rPr>
+              <w:t>n</w:t>
+            </w:r>
+            <w:r>
+              <w:rPr>
+                <w:rFonts w:cs="Calibri"/>
+                <w:i w:val="0"/>
+                <w:iCs w:val="0"/>
+                <w:sz w:val="20"/>
+                <w:szCs w:val="20"/>
+              </w:rPr>
+              <w:t xml:space="preserve"> Architecture, </w:t>
             </w:r>
             <w:r>
               <w:rPr>
@@ -1542,7 +1581,9 @@
       </w:pPr>
       <w:r>
         <w:rPr>
-          <w:rFonts w:ascii="Arial Nova" w:hAnsi="Arial Nova"/>
+          <w:rFonts w:ascii="Apple Color Emoji" w:hAnsi="Apple Color Emoji" w:cs="Apple Color Emoji"/>
+          <w:b/>
+          <w:bCs/>
           <w:noProof/>
           <w:color w:val="0070C0"/>
           <w:sz w:val="24"/>
@@ -1552,31 +1593,27 @@
         <mc:AlternateContent>
           <mc:Choice Requires="wps">
             <w:drawing>
-              <wp:anchor distT="0" distB="0" distL="114300" distR="114300" simplePos="0" relativeHeight="251656704" behindDoc="0" locked="0" layoutInCell="1" allowOverlap="1" wp14:anchorId="0999E141" wp14:editId="784F1EF8">
+              <wp:anchor distT="0" distB="0" distL="114300" distR="114300" simplePos="0" relativeHeight="251671040" behindDoc="0" locked="0" layoutInCell="1" allowOverlap="1" wp14:anchorId="05E868CC" wp14:editId="69FCBD9D">
                 <wp:simplePos x="0" y="0"/>
                 <wp:positionH relativeFrom="column">
-                  <wp:posOffset>1286510</wp:posOffset>
+                  <wp:posOffset>1475772</wp:posOffset>
                 </wp:positionH>
-                <wp:positionV relativeFrom="line">
-                  <wp:posOffset>130810</wp:posOffset>
+                <wp:positionV relativeFrom="paragraph">
+                  <wp:posOffset>136316</wp:posOffset>
                 </wp:positionV>
-                <wp:extent cx="5311140" cy="0"/>
-                <wp:effectExtent l="0" t="63500" r="60960" b="63500"/>
+                <wp:extent cx="5162309" cy="0"/>
+                <wp:effectExtent l="0" t="63500" r="70485" b="76200"/>
                 <wp:wrapNone/>
-                <wp:docPr id="1736079096" name="AutoShape 14"/>
-                <wp:cNvGraphicFramePr>
-                  <a:graphicFrameLocks xmlns:a="http://schemas.openxmlformats.org/drawingml/2006/main"/>
-                </wp:cNvGraphicFramePr>
+                <wp:docPr id="500423525" name="Straight Arrow Connector 24"/>
+                <wp:cNvGraphicFramePr/>
                 <a:graphic xmlns:a="http://schemas.openxmlformats.org/drawingml/2006/main">
                   <a:graphicData uri="http://schemas.microsoft.com/office/word/2010/wordprocessingShape">
                     <wps:wsp>
-                      <wps:cNvCnPr>
-                        <a:cxnSpLocks/>
-                      </wps:cNvCnPr>
-                      <wps:spPr bwMode="auto">
+                      <wps:cNvCnPr/>
+                      <wps:spPr>
                         <a:xfrm>
                           <a:off x="0" y="0"/>
-                          <a:ext cx="5311140" cy="0"/>
+                          <a:ext cx="5162309" cy="0"/>
                         </a:xfrm>
                         <a:prstGeom prst="straightConnector1">
                           <a:avLst/>
@@ -1602,25 +1639,42 @@
                     </wps:wsp>
                   </a:graphicData>
                 </a:graphic>
-                <wp14:sizeRelH relativeFrom="page">
+                <wp14:sizeRelH relativeFrom="margin">
                   <wp14:pctWidth>0</wp14:pctWidth>
                 </wp14:sizeRelH>
-                <wp14:sizeRelV relativeFrom="page">
-                  <wp14:pctHeight>0</wp14:pctHeight>
-                </wp14:sizeRelV>
               </wp:anchor>
             </w:drawing>
           </mc:Choice>
           <mc:Fallback>
             <w:pict>
-              <v:shape w14:anchorId="7D516744" id="AutoShape 14" o:spid="_x0000_s1026" type="#_x0000_t32" style="position:absolute;margin-left:101.3pt;margin-top:10.3pt;width:418.2pt;height:0;z-index:251656704;visibility:visible;mso-wrap-style:square;mso-width-percent:0;mso-height-percent:0;mso-wrap-distance-left:9pt;mso-wrap-distance-top:0;mso-wrap-distance-right:9pt;mso-wrap-distance-bottom:0;mso-position-horizontal:absolute;mso-position-horizontal-relative:text;mso-position-vertical:absolute;mso-position-vertical-relative:line;mso-width-percent:0;mso-height-percent:0;mso-width-relative:page;mso-height-relative:page" o:gfxdata="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" strokecolor="#7f7f7f">
+              <v:shape w14:anchorId="16AF0000" id="Straight Arrow Connector 24" o:spid="_x0000_s1026" type="#_x0000_t32" style="position:absolute;margin-left:116.2pt;margin-top:10.75pt;width:406.5pt;height:0;z-index:251671040;visibility:visible;mso-wrap-style:square;mso-width-percent:0;mso-wrap-distance-left:9pt;mso-wrap-distance-top:0;mso-wrap-distance-right:9pt;mso-wrap-distance-bottom:0;mso-position-horizontal:absolute;mso-position-horizontal-relative:text;mso-position-vertical:absolute;mso-position-vertical-relative:text;mso-width-percent:0;mso-width-relative:margin" o:gfxdata="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" strokecolor="#7f7f7f">
                 <v:stroke endarrow="diamond" endarrowwidth="wide" endarrowlength="long"/>
-                <o:lock v:ext="edit" shapetype="f"/>
-                <w10:wrap anchory="line"/>
               </v:shape>
             </w:pict>
           </mc:Fallback>
         </mc:AlternateContent>
+      </w:r>
+      <w:r>
+        <w:rPr>
+          <w:rFonts w:ascii="Apple Color Emoji" w:hAnsi="Apple Color Emoji" w:cs="Apple Color Emoji"/>
+          <w:b/>
+          <w:bCs/>
+          <w:color w:val="0070C0"/>
+          <w:sz w:val="24"/>
+          <w:szCs w:val="24"/>
+        </w:rPr>
+        <w:t>💼</w:t>
+      </w:r>
+      <w:r>
+        <w:rPr>
+          <w:rFonts w:cs="Calibri"/>
+          <w:b/>
+          <w:bCs/>
+          <w:color w:val="0070C0"/>
+          <w:sz w:val="24"/>
+          <w:szCs w:val="24"/>
+        </w:rPr>
+        <w:t xml:space="preserve"> </w:t>
       </w:r>
       <w:r>
         <w:rPr>
@@ -2312,7 +2366,9 @@
       </w:pPr>
       <w:r>
         <w:rPr>
-          <w:rFonts w:ascii="Arial Nova" w:hAnsi="Arial Nova"/>
+          <w:rFonts w:ascii="Calibri" w:hAnsi="Calibri" w:cs="Calibri"/>
+          <w:b/>
+          <w:bCs/>
           <w:noProof/>
           <w:color w:val="0070C0"/>
           <w:sz w:val="24"/>
@@ -2320,31 +2376,27 @@
         <mc:AlternateContent>
           <mc:Choice Requires="wps">
             <w:drawing>
-              <wp:anchor distT="0" distB="0" distL="114300" distR="114300" simplePos="0" relativeHeight="251666944" behindDoc="0" locked="0" layoutInCell="1" allowOverlap="1" wp14:anchorId="2039775E" wp14:editId="57A51841">
+              <wp:anchor distT="0" distB="0" distL="114300" distR="114300" simplePos="0" relativeHeight="251670016" behindDoc="0" locked="0" layoutInCell="1" allowOverlap="1" wp14:anchorId="5BEF1DFF" wp14:editId="6E53AE3A">
                 <wp:simplePos x="0" y="0"/>
                 <wp:positionH relativeFrom="column">
-                  <wp:posOffset>1105535</wp:posOffset>
+                  <wp:posOffset>1221105</wp:posOffset>
                 </wp:positionH>
-                <wp:positionV relativeFrom="line">
-                  <wp:posOffset>143510</wp:posOffset>
+                <wp:positionV relativeFrom="paragraph">
+                  <wp:posOffset>182390</wp:posOffset>
                 </wp:positionV>
-                <wp:extent cx="5460365" cy="0"/>
-                <wp:effectExtent l="0" t="63500" r="64135" b="63500"/>
+                <wp:extent cx="5416558" cy="0"/>
+                <wp:effectExtent l="0" t="63500" r="69850" b="76200"/>
                 <wp:wrapNone/>
-                <wp:docPr id="1369865400" name="AutoShape 12"/>
-                <wp:cNvGraphicFramePr>
-                  <a:graphicFrameLocks xmlns:a="http://schemas.openxmlformats.org/drawingml/2006/main"/>
-                </wp:cNvGraphicFramePr>
+                <wp:docPr id="873604797" name="Straight Arrow Connector 20"/>
+                <wp:cNvGraphicFramePr/>
                 <a:graphic xmlns:a="http://schemas.openxmlformats.org/drawingml/2006/main">
                   <a:graphicData uri="http://schemas.microsoft.com/office/word/2010/wordprocessingShape">
                     <wps:wsp>
-                      <wps:cNvCnPr>
-                        <a:cxnSpLocks/>
-                      </wps:cNvCnPr>
-                      <wps:spPr bwMode="auto">
+                      <wps:cNvCnPr/>
+                      <wps:spPr>
                         <a:xfrm>
                           <a:off x="0" y="0"/>
-                          <a:ext cx="5460365" cy="0"/>
+                          <a:ext cx="5416558" cy="0"/>
                         </a:xfrm>
                         <a:prstGeom prst="straightConnector1">
                           <a:avLst/>
@@ -2370,29 +2422,40 @@
                     </wps:wsp>
                   </a:graphicData>
                 </a:graphic>
-                <wp14:sizeRelH relativeFrom="page">
+                <wp14:sizeRelH relativeFrom="margin">
                   <wp14:pctWidth>0</wp14:pctWidth>
                 </wp14:sizeRelH>
-                <wp14:sizeRelV relativeFrom="page">
-                  <wp14:pctHeight>0</wp14:pctHeight>
-                </wp14:sizeRelV>
               </wp:anchor>
             </w:drawing>
           </mc:Choice>
           <mc:Fallback>
             <w:pict>
-              <v:shapetype w14:anchorId="1CFEDC91" id="_x0000_t32" coordsize="21600,21600" o:spt="32" o:oned="t" path="m,l21600,21600e" filled="f">
-                <v:path arrowok="t" fillok="f" o:connecttype="none"/>
-                <o:lock v:ext="edit" shapetype="t"/>
-              </v:shapetype>
-              <v:shape id="AutoShape 12" o:spid="_x0000_s1026" type="#_x0000_t32" style="position:absolute;margin-left:87.05pt;margin-top:11.3pt;width:429.95pt;height:0;z-index:251666944;visibility:visible;mso-wrap-style:square;mso-width-percent:0;mso-height-percent:0;mso-wrap-distance-left:9pt;mso-wrap-distance-top:0;mso-wrap-distance-right:9pt;mso-wrap-distance-bottom:0;mso-position-horizontal:absolute;mso-position-horizontal-relative:text;mso-position-vertical:absolute;mso-position-vertical-relative:line;mso-width-percent:0;mso-height-percent:0;mso-width-relative:page;mso-height-relative:page" o:gfxdata="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" strokecolor="#7f7f7f">
+              <v:shape w14:anchorId="4D89754D" id="Straight Arrow Connector 20" o:spid="_x0000_s1026" type="#_x0000_t32" style="position:absolute;margin-left:96.15pt;margin-top:14.35pt;width:426.5pt;height:0;z-index:251670016;visibility:visible;mso-wrap-style:square;mso-width-percent:0;mso-wrap-distance-left:9pt;mso-wrap-distance-top:0;mso-wrap-distance-right:9pt;mso-wrap-distance-bottom:0;mso-position-horizontal:absolute;mso-position-horizontal-relative:text;mso-position-vertical:absolute;mso-position-vertical-relative:text;mso-width-percent:0;mso-width-relative:margin" o:gfxdata="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" strokecolor="#7f7f7f">
                 <v:stroke endarrow="diamond" endarrowwidth="wide" endarrowlength="long"/>
-                <o:lock v:ext="edit" shapetype="f"/>
-                <w10:wrap anchory="line"/>
               </v:shape>
             </w:pict>
           </mc:Fallback>
         </mc:AlternateContent>
+      </w:r>
+      <w:r>
+        <w:rPr>
+          <w:rFonts w:ascii="Apple Color Emoji" w:hAnsi="Apple Color Emoji" w:cs="Apple Color Emoji"/>
+          <w:b/>
+          <w:bCs/>
+          <w:color w:val="0070C0"/>
+          <w:sz w:val="24"/>
+        </w:rPr>
+        <w:t>🏆</w:t>
+      </w:r>
+      <w:r>
+        <w:rPr>
+          <w:rFonts w:ascii="Calibri" w:hAnsi="Calibri" w:cs="Calibri"/>
+          <w:b/>
+          <w:bCs/>
+          <w:color w:val="0070C0"/>
+          <w:sz w:val="24"/>
+        </w:rPr>
+        <w:t xml:space="preserve"> </w:t>
       </w:r>
       <w:r>
         <w:rPr>
@@ -5447,6 +5510,7 @@
       <w:footerReference w:type="even" r:id="rId10"/>
       <w:footerReference w:type="default" r:id="rId11"/>
       <w:headerReference w:type="first" r:id="rId12"/>
+      <w:footerReference w:type="first" r:id="rId13"/>
       <w:pgSz w:w="11906" w:h="16838"/>
       <w:pgMar w:top="720" w:right="720" w:bottom="720" w:left="720" w:header="0" w:footer="0" w:gutter="0"/>
       <w:pgBorders w:offsetFrom="page">
@@ -5782,6 +5846,16 @@
       </w:rPr>
       <w:t xml:space="preserve"> </w:t>
     </w:r>
+  </w:p>
+</w:ftr>
+</file>
+
+<file path=word/footer3.xml><?xml version="1.0" encoding="utf-8"?>
+<w:ftr xmlns:wpc="http://schemas.microsoft.com/office/word/2010/wordprocessingCanvas" xmlns:cx="http://schemas.microsoft.com/office/drawing/2014/chartex" xmlns:cx1="http://schemas.microsoft.com/office/drawing/2015/9/8/chartex" xmlns:cx2="http://schemas.microsoft.com/office/drawing/2015/10/21/chartex" xmlns:cx3="http://schemas.microsoft.com/office/drawing/2016/5/9/chartex" xmlns:cx4="http://schemas.microsoft.com/office/drawing/2016/5/10/chartex" xmlns:cx5="http://schemas.microsoft.com/office/drawing/2016/5/11/chartex" xmlns:cx6="http://schemas.microsoft.com/office/drawing/2016/5/12/chartex" xmlns:cx7="http://schemas.microsoft.com/office/drawing/2016/5/13/chartex" xmlns:cx8="http://schemas.microsoft.com/office/drawing/2016/5/14/chartex" xmlns:mc="http://schemas.openxmlformats.org/markup-compatibility/2006" xmlns:aink="http://schemas.microsoft.com/office/drawing/2016/ink" xmlns:am3d="http://schemas.microsoft.com/office/drawing/2017/model3d" xmlns:o="urn:schemas-microsoft-com:office:office" xmlns:oel="http://schemas.microsoft.com/office/2019/extlst" xmlns:r="http://schemas.openxmlformats.org/officeDocument/2006/relationships" xmlns:m="http://schemas.openxmlformats.org/officeDocument/2006/math" xmlns:v="urn:schemas-microsoft-com:vml" xmlns:wp14="http://schemas.microsoft.com/office/word/2010/wordprocessingDrawing" xmlns:wp="http://schemas.openxmlformats.org/drawingml/2006/wordprocessingDrawing" xmlns:w10="urn:schemas-microsoft-com:office:word" xmlns:w="http://schemas.openxmlformats.org/wordprocessingml/2006/main" xmlns:w14="http://schemas.microsoft.com/office/word/2010/wordml" xmlns:w15="http://schemas.microsoft.com/office/word/2012/wordml" xmlns:w16cex="http://schemas.microsoft.com/office/word/2018/wordml/cex" xmlns:w16cid="http://schemas.microsoft.com/office/word/2016/wordml/cid" xmlns:w16="http://schemas.microsoft.com/office/word/2018/wordml" xmlns:w16du="http://schemas.microsoft.com/office/word/2023/wordml/word16du" xmlns:w16sdtdh="http://schemas.microsoft.com/office/word/2020/wordml/sdtdatahash" xmlns:w16sdtfl="http://schemas.microsoft.com/office/word/2024/wordml/sdtformatlock" xmlns:w16se="http://schemas.microsoft.com/office/word/2015/wordml/symex" xmlns:wpg="http://schemas.microsoft.com/office/word/2010/wordprocessingGroup" xmlns:wpi="http://schemas.microsoft.com/office/word/2010/wordprocessingInk" xmlns:wne="http://schemas.microsoft.com/office/word/2006/wordml" xmlns:wps="http://schemas.microsoft.com/office/word/2010/wordprocessingShape" mc:Ignorable="w14 w15 w16se w16cid w16 w16cex w16sdtdh w16sdtfl w16du wp14">
+  <w:p>
+    <w:pPr>
+      <w:pStyle w:val="Footer"/>
+    </w:pPr>
   </w:p>
 </w:ftr>
 </file>

</xml_diff>

<commit_message>
Changed role to Senior Software. engineer
</commit_message>
<xml_diff>
--- a/AJAYKUMAR_DHANDAPANI.docx
+++ b/AJAYKUMAR_DHANDAPANI.docx
@@ -1,6 +1,6 @@
 
 <file path=word/document.xml><?xml version="1.0" encoding="utf-8"?>
-<w:document xmlns:wpc="http://schemas.microsoft.com/office/word/2010/wordprocessingCanvas" xmlns:cx="http://schemas.microsoft.com/office/drawing/2014/chartex" xmlns:cx1="http://schemas.microsoft.com/office/drawing/2015/9/8/chartex" xmlns:cx2="http://schemas.microsoft.com/office/drawing/2015/10/21/chartex" xmlns:cx3="http://schemas.microsoft.com/office/drawing/2016/5/9/chartex" xmlns:cx4="http://schemas.microsoft.com/office/drawing/2016/5/10/chartex" xmlns:cx5="http://schemas.microsoft.com/office/drawing/2016/5/11/chartex" xmlns:cx6="http://schemas.microsoft.com/office/drawing/2016/5/12/chartex" xmlns:cx7="http://schemas.microsoft.com/office/drawing/2016/5/13/chartex" xmlns:cx8="http://schemas.microsoft.com/office/drawing/2016/5/14/chartex" xmlns:mc="http://schemas.openxmlformats.org/markup-compatibility/2006" xmlns:aink="http://schemas.microsoft.com/office/drawing/2016/ink" xmlns:am3d="http://schemas.microsoft.com/office/drawing/2017/model3d" xmlns:o="urn:schemas-microsoft-com:office:office" xmlns:oel="http://schemas.microsoft.com/office/2019/extlst" xmlns:r="http://schemas.openxmlformats.org/officeDocument/2006/relationships" xmlns:m="http://schemas.openxmlformats.org/officeDocument/2006/math" xmlns:v="urn:schemas-microsoft-com:vml" xmlns:wp14="http://schemas.microsoft.com/office/word/2010/wordprocessingDrawing" xmlns:wp="http://schemas.openxmlformats.org/drawingml/2006/wordprocessingDrawing" xmlns:w10="urn:schemas-microsoft-com:office:word" xmlns:w="http://schemas.openxmlformats.org/wordprocessingml/2006/main" xmlns:w14="http://schemas.microsoft.com/office/word/2010/wordml" xmlns:w15="http://schemas.microsoft.com/office/word/2012/wordml" xmlns:w16cex="http://schemas.microsoft.com/office/word/2018/wordml/cex" xmlns:w16cid="http://schemas.microsoft.com/office/word/2016/wordml/cid" xmlns:w16="http://schemas.microsoft.com/office/word/2018/wordml" xmlns:w16du="http://schemas.microsoft.com/office/word/2023/wordml/word16du" xmlns:w16sdtdh="http://schemas.microsoft.com/office/word/2020/wordml/sdtdatahash" xmlns:w16sdtfl="http://schemas.microsoft.com/office/word/2024/wordml/sdtformatlock" xmlns:w16se="http://schemas.microsoft.com/office/word/2015/wordml/symex" xmlns:wpg="http://schemas.microsoft.com/office/word/2010/wordprocessingGroup" xmlns:wpi="http://schemas.microsoft.com/office/word/2010/wordprocessingInk" xmlns:wne="http://schemas.microsoft.com/office/word/2006/wordml" xmlns:wps="http://schemas.microsoft.com/office/word/2010/wordprocessingShape" mc:Ignorable="w14 w15 w16se w16cid w16 w16cex w16sdtdh w16sdtfl w16du wp14">
+<w:document xmlns:wpc="http://schemas.microsoft.com/office/word/2010/wordprocessingCanvas" xmlns:cx="http://schemas.microsoft.com/office/drawing/2014/chartex" xmlns:cx1="http://schemas.microsoft.com/office/drawing/2015/9/8/chartex" xmlns:cx2="http://schemas.microsoft.com/office/drawing/2015/10/21/chartex" xmlns:cx3="http://schemas.microsoft.com/office/drawing/2016/5/9/chartex" xmlns:cx4="http://schemas.microsoft.com/office/drawing/2016/5/10/chartex" xmlns:cx5="http://schemas.microsoft.com/office/drawing/2016/5/11/chartex" xmlns:cx6="http://schemas.microsoft.com/office/drawing/2016/5/12/chartex" xmlns:cx7="http://schemas.microsoft.com/office/drawing/2016/5/13/chartex" xmlns:cx8="http://schemas.microsoft.com/office/drawing/2016/5/14/chartex" xmlns:mc="http://schemas.openxmlformats.org/markup-compatibility/2006" xmlns:m="http://schemas.openxmlformats.org/officeDocument/2006/math" xmlns:aink="http://schemas.microsoft.com/office/drawing/2016/ink" xmlns:am3d="http://schemas.microsoft.com/office/drawing/2017/model3d" xmlns:oel="http://schemas.microsoft.com/office/2019/extlst" xmlns:r="http://schemas.openxmlformats.org/officeDocument/2006/relationships" xmlns:wp14="http://schemas.microsoft.com/office/word/2010/wordprocessingDrawing" xmlns:wp="http://schemas.openxmlformats.org/drawingml/2006/wordprocessingDrawing" xmlns:wpg="http://schemas.microsoft.com/office/word/2010/wordprocessingGroup" xmlns:wpi="http://schemas.microsoft.com/office/word/2010/wordprocessingInk" xmlns:wps="http://schemas.microsoft.com/office/word/2010/wordprocessingShape" xmlns:o="urn:schemas-microsoft-com:office:office" xmlns:v="urn:schemas-microsoft-com:vml" xmlns:w10="urn:schemas-microsoft-com:office:word" xmlns:w="http://schemas.openxmlformats.org/wordprocessingml/2006/main" xmlns:w14="http://schemas.microsoft.com/office/word/2010/wordml" xmlns:w15="http://schemas.microsoft.com/office/word/2012/wordml" xmlns:w16cex="http://schemas.microsoft.com/office/word/2018/wordml/cex" xmlns:w16cid="http://schemas.microsoft.com/office/word/2016/wordml/cid" xmlns:w16="http://schemas.microsoft.com/office/word/2018/wordml" xmlns:w16sdtdh="http://schemas.microsoft.com/office/word/2020/wordml/sdtdatahash" xmlns:w16sdtfl="http://schemas.microsoft.com/office/word/2024/wordml/sdtformatlock" xmlns:w16se="http://schemas.microsoft.com/office/word/2015/wordml/symex" xmlns:w16du="http://schemas.microsoft.com/office/word/2023/wordml/word16du" xmlns:wne="http://schemas.microsoft.com/office/word/2006/wordml" mc:Ignorable="w14 w15 w16se w16cid w16 w16cex w16sdtdh w16sdtfl w16du wp14">
   <w:background w:color="FFFFFF"/>
   <w:body>
     <w:p>
@@ -1735,7 +1735,16 @@
           <w:sz w:val="20"/>
           <w:szCs w:val="20"/>
         </w:rPr>
-        <w:t xml:space="preserve">Full Stack Developer | </w:t>
+        <w:t>Senior Software Engineer</w:t>
+      </w:r>
+      <w:r>
+        <w:rPr>
+          <w:rFonts w:cs="Calibri"/>
+          <w:b/>
+          <w:sz w:val="20"/>
+          <w:szCs w:val="20"/>
+        </w:rPr>
+        <w:t xml:space="preserve"> | </w:t>
       </w:r>
       <w:r>
         <w:rPr>
@@ -5528,7 +5537,7 @@
 </file>
 
 <file path=word/endnotes.xml><?xml version="1.0" encoding="utf-8"?>
-<w:endnotes xmlns:wpc="http://schemas.microsoft.com/office/word/2010/wordprocessingCanvas" xmlns:cx="http://schemas.microsoft.com/office/drawing/2014/chartex" xmlns:cx1="http://schemas.microsoft.com/office/drawing/2015/9/8/chartex" xmlns:cx2="http://schemas.microsoft.com/office/drawing/2015/10/21/chartex" xmlns:cx3="http://schemas.microsoft.com/office/drawing/2016/5/9/chartex" xmlns:cx4="http://schemas.microsoft.com/office/drawing/2016/5/10/chartex" xmlns:cx5="http://schemas.microsoft.com/office/drawing/2016/5/11/chartex" xmlns:cx6="http://schemas.microsoft.com/office/drawing/2016/5/12/chartex" xmlns:cx7="http://schemas.microsoft.com/office/drawing/2016/5/13/chartex" xmlns:cx8="http://schemas.microsoft.com/office/drawing/2016/5/14/chartex" xmlns:mc="http://schemas.openxmlformats.org/markup-compatibility/2006" xmlns:aink="http://schemas.microsoft.com/office/drawing/2016/ink" xmlns:am3d="http://schemas.microsoft.com/office/drawing/2017/model3d" xmlns:o="urn:schemas-microsoft-com:office:office" xmlns:oel="http://schemas.microsoft.com/office/2019/extlst" xmlns:r="http://schemas.openxmlformats.org/officeDocument/2006/relationships" xmlns:m="http://schemas.openxmlformats.org/officeDocument/2006/math" xmlns:v="urn:schemas-microsoft-com:vml" xmlns:wp14="http://schemas.microsoft.com/office/word/2010/wordprocessingDrawing" xmlns:wp="http://schemas.openxmlformats.org/drawingml/2006/wordprocessingDrawing" xmlns:w10="urn:schemas-microsoft-com:office:word" xmlns:w="http://schemas.openxmlformats.org/wordprocessingml/2006/main" xmlns:w14="http://schemas.microsoft.com/office/word/2010/wordml" xmlns:w15="http://schemas.microsoft.com/office/word/2012/wordml" xmlns:w16cex="http://schemas.microsoft.com/office/word/2018/wordml/cex" xmlns:w16cid="http://schemas.microsoft.com/office/word/2016/wordml/cid" xmlns:w16="http://schemas.microsoft.com/office/word/2018/wordml" xmlns:w16du="http://schemas.microsoft.com/office/word/2023/wordml/word16du" xmlns:w16sdtdh="http://schemas.microsoft.com/office/word/2020/wordml/sdtdatahash" xmlns:w16sdtfl="http://schemas.microsoft.com/office/word/2024/wordml/sdtformatlock" xmlns:w16se="http://schemas.microsoft.com/office/word/2015/wordml/symex" xmlns:wpg="http://schemas.microsoft.com/office/word/2010/wordprocessingGroup" xmlns:wpi="http://schemas.microsoft.com/office/word/2010/wordprocessingInk" xmlns:wne="http://schemas.microsoft.com/office/word/2006/wordml" xmlns:wps="http://schemas.microsoft.com/office/word/2010/wordprocessingShape" mc:Ignorable="w14 w15 w16se w16cid w16 w16cex w16sdtdh w16sdtfl w16du wp14">
+<w:endnotes xmlns:wpc="http://schemas.microsoft.com/office/word/2010/wordprocessingCanvas" xmlns:cx="http://schemas.microsoft.com/office/drawing/2014/chartex" xmlns:cx1="http://schemas.microsoft.com/office/drawing/2015/9/8/chartex" xmlns:cx2="http://schemas.microsoft.com/office/drawing/2015/10/21/chartex" xmlns:cx3="http://schemas.microsoft.com/office/drawing/2016/5/9/chartex" xmlns:cx4="http://schemas.microsoft.com/office/drawing/2016/5/10/chartex" xmlns:cx5="http://schemas.microsoft.com/office/drawing/2016/5/11/chartex" xmlns:cx6="http://schemas.microsoft.com/office/drawing/2016/5/12/chartex" xmlns:cx7="http://schemas.microsoft.com/office/drawing/2016/5/13/chartex" xmlns:cx8="http://schemas.microsoft.com/office/drawing/2016/5/14/chartex" xmlns:mc="http://schemas.openxmlformats.org/markup-compatibility/2006" xmlns:m="http://schemas.openxmlformats.org/officeDocument/2006/math" xmlns:aink="http://schemas.microsoft.com/office/drawing/2016/ink" xmlns:am3d="http://schemas.microsoft.com/office/drawing/2017/model3d" xmlns:oel="http://schemas.microsoft.com/office/2019/extlst" xmlns:r="http://schemas.openxmlformats.org/officeDocument/2006/relationships" xmlns:wp14="http://schemas.microsoft.com/office/word/2010/wordprocessingDrawing" xmlns:wp="http://schemas.openxmlformats.org/drawingml/2006/wordprocessingDrawing" xmlns:wpg="http://schemas.microsoft.com/office/word/2010/wordprocessingGroup" xmlns:wpi="http://schemas.microsoft.com/office/word/2010/wordprocessingInk" xmlns:wps="http://schemas.microsoft.com/office/word/2010/wordprocessingShape" xmlns:o="urn:schemas-microsoft-com:office:office" xmlns:v="urn:schemas-microsoft-com:vml" xmlns:w10="urn:schemas-microsoft-com:office:word" xmlns:w="http://schemas.openxmlformats.org/wordprocessingml/2006/main" xmlns:w14="http://schemas.microsoft.com/office/word/2010/wordml" xmlns:w15="http://schemas.microsoft.com/office/word/2012/wordml" xmlns:w16cex="http://schemas.microsoft.com/office/word/2018/wordml/cex" xmlns:w16cid="http://schemas.microsoft.com/office/word/2016/wordml/cid" xmlns:w16="http://schemas.microsoft.com/office/word/2018/wordml" xmlns:w16sdtdh="http://schemas.microsoft.com/office/word/2020/wordml/sdtdatahash" xmlns:w16sdtfl="http://schemas.microsoft.com/office/word/2024/wordml/sdtformatlock" xmlns:w16se="http://schemas.microsoft.com/office/word/2015/wordml/symex" xmlns:w16du="http://schemas.microsoft.com/office/word/2023/wordml/word16du" xmlns:wne="http://schemas.microsoft.com/office/word/2006/wordml" mc:Ignorable="w14 w15 w16se w16cid w16 w16cex w16sdtdh w16sdtfl w16du wp14">
   <w:endnote w:type="separator" w:id="-1">
     <w:p>
       <w:r>
@@ -5547,7 +5556,7 @@
 </file>
 
 <file path=word/footer1.xml><?xml version="1.0" encoding="utf-8"?>
-<w:ftr xmlns:wpc="http://schemas.microsoft.com/office/word/2010/wordprocessingCanvas" xmlns:cx="http://schemas.microsoft.com/office/drawing/2014/chartex" xmlns:cx1="http://schemas.microsoft.com/office/drawing/2015/9/8/chartex" xmlns:cx2="http://schemas.microsoft.com/office/drawing/2015/10/21/chartex" xmlns:cx3="http://schemas.microsoft.com/office/drawing/2016/5/9/chartex" xmlns:cx4="http://schemas.microsoft.com/office/drawing/2016/5/10/chartex" xmlns:cx5="http://schemas.microsoft.com/office/drawing/2016/5/11/chartex" xmlns:cx6="http://schemas.microsoft.com/office/drawing/2016/5/12/chartex" xmlns:cx7="http://schemas.microsoft.com/office/drawing/2016/5/13/chartex" xmlns:cx8="http://schemas.microsoft.com/office/drawing/2016/5/14/chartex" xmlns:mc="http://schemas.openxmlformats.org/markup-compatibility/2006" xmlns:aink="http://schemas.microsoft.com/office/drawing/2016/ink" xmlns:am3d="http://schemas.microsoft.com/office/drawing/2017/model3d" xmlns:o="urn:schemas-microsoft-com:office:office" xmlns:oel="http://schemas.microsoft.com/office/2019/extlst" xmlns:r="http://schemas.openxmlformats.org/officeDocument/2006/relationships" xmlns:m="http://schemas.openxmlformats.org/officeDocument/2006/math" xmlns:v="urn:schemas-microsoft-com:vml" xmlns:wp14="http://schemas.microsoft.com/office/word/2010/wordprocessingDrawing" xmlns:wp="http://schemas.openxmlformats.org/drawingml/2006/wordprocessingDrawing" xmlns:w10="urn:schemas-microsoft-com:office:word" xmlns:w="http://schemas.openxmlformats.org/wordprocessingml/2006/main" xmlns:w14="http://schemas.microsoft.com/office/word/2010/wordml" xmlns:w15="http://schemas.microsoft.com/office/word/2012/wordml" xmlns:w16cex="http://schemas.microsoft.com/office/word/2018/wordml/cex" xmlns:w16cid="http://schemas.microsoft.com/office/word/2016/wordml/cid" xmlns:w16="http://schemas.microsoft.com/office/word/2018/wordml" xmlns:w16du="http://schemas.microsoft.com/office/word/2023/wordml/word16du" xmlns:w16sdtdh="http://schemas.microsoft.com/office/word/2020/wordml/sdtdatahash" xmlns:w16sdtfl="http://schemas.microsoft.com/office/word/2024/wordml/sdtformatlock" xmlns:w16se="http://schemas.microsoft.com/office/word/2015/wordml/symex" xmlns:wpg="http://schemas.microsoft.com/office/word/2010/wordprocessingGroup" xmlns:wpi="http://schemas.microsoft.com/office/word/2010/wordprocessingInk" xmlns:wne="http://schemas.microsoft.com/office/word/2006/wordml" xmlns:wps="http://schemas.microsoft.com/office/word/2010/wordprocessingShape" mc:Ignorable="w14 w15 w16se w16cid w16 w16cex w16sdtdh w16sdtfl w16du wp14">
+<w:ftr xmlns:wpc="http://schemas.microsoft.com/office/word/2010/wordprocessingCanvas" xmlns:cx="http://schemas.microsoft.com/office/drawing/2014/chartex" xmlns:cx1="http://schemas.microsoft.com/office/drawing/2015/9/8/chartex" xmlns:cx2="http://schemas.microsoft.com/office/drawing/2015/10/21/chartex" xmlns:cx3="http://schemas.microsoft.com/office/drawing/2016/5/9/chartex" xmlns:cx4="http://schemas.microsoft.com/office/drawing/2016/5/10/chartex" xmlns:cx5="http://schemas.microsoft.com/office/drawing/2016/5/11/chartex" xmlns:cx6="http://schemas.microsoft.com/office/drawing/2016/5/12/chartex" xmlns:cx7="http://schemas.microsoft.com/office/drawing/2016/5/13/chartex" xmlns:cx8="http://schemas.microsoft.com/office/drawing/2016/5/14/chartex" xmlns:mc="http://schemas.openxmlformats.org/markup-compatibility/2006" xmlns:m="http://schemas.openxmlformats.org/officeDocument/2006/math" xmlns:aink="http://schemas.microsoft.com/office/drawing/2016/ink" xmlns:am3d="http://schemas.microsoft.com/office/drawing/2017/model3d" xmlns:oel="http://schemas.microsoft.com/office/2019/extlst" xmlns:r="http://schemas.openxmlformats.org/officeDocument/2006/relationships" xmlns:wp14="http://schemas.microsoft.com/office/word/2010/wordprocessingDrawing" xmlns:wp="http://schemas.openxmlformats.org/drawingml/2006/wordprocessingDrawing" xmlns:wpg="http://schemas.microsoft.com/office/word/2010/wordprocessingGroup" xmlns:wpi="http://schemas.microsoft.com/office/word/2010/wordprocessingInk" xmlns:wps="http://schemas.microsoft.com/office/word/2010/wordprocessingShape" xmlns:o="urn:schemas-microsoft-com:office:office" xmlns:v="urn:schemas-microsoft-com:vml" xmlns:w10="urn:schemas-microsoft-com:office:word" xmlns:w="http://schemas.openxmlformats.org/wordprocessingml/2006/main" xmlns:w14="http://schemas.microsoft.com/office/word/2010/wordml" xmlns:w15="http://schemas.microsoft.com/office/word/2012/wordml" xmlns:w16cex="http://schemas.microsoft.com/office/word/2018/wordml/cex" xmlns:w16cid="http://schemas.microsoft.com/office/word/2016/wordml/cid" xmlns:w16="http://schemas.microsoft.com/office/word/2018/wordml" xmlns:w16sdtdh="http://schemas.microsoft.com/office/word/2020/wordml/sdtdatahash" xmlns:w16sdtfl="http://schemas.microsoft.com/office/word/2024/wordml/sdtformatlock" xmlns:w16se="http://schemas.microsoft.com/office/word/2015/wordml/symex" xmlns:w16du="http://schemas.microsoft.com/office/word/2023/wordml/word16du" xmlns:wne="http://schemas.microsoft.com/office/word/2006/wordml" mc:Ignorable="w14 w15 w16se w16cid w16 w16cex w16sdtdh w16sdtfl w16du wp14">
   <w:p>
     <w:pPr>
       <w:pStyle w:val="Footer"/>
@@ -5699,7 +5708,7 @@
 </file>
 
 <file path=word/footer2.xml><?xml version="1.0" encoding="utf-8"?>
-<w:ftr xmlns:wpc="http://schemas.microsoft.com/office/word/2010/wordprocessingCanvas" xmlns:cx="http://schemas.microsoft.com/office/drawing/2014/chartex" xmlns:cx1="http://schemas.microsoft.com/office/drawing/2015/9/8/chartex" xmlns:cx2="http://schemas.microsoft.com/office/drawing/2015/10/21/chartex" xmlns:cx3="http://schemas.microsoft.com/office/drawing/2016/5/9/chartex" xmlns:cx4="http://schemas.microsoft.com/office/drawing/2016/5/10/chartex" xmlns:cx5="http://schemas.microsoft.com/office/drawing/2016/5/11/chartex" xmlns:cx6="http://schemas.microsoft.com/office/drawing/2016/5/12/chartex" xmlns:cx7="http://schemas.microsoft.com/office/drawing/2016/5/13/chartex" xmlns:cx8="http://schemas.microsoft.com/office/drawing/2016/5/14/chartex" xmlns:mc="http://schemas.openxmlformats.org/markup-compatibility/2006" xmlns:aink="http://schemas.microsoft.com/office/drawing/2016/ink" xmlns:am3d="http://schemas.microsoft.com/office/drawing/2017/model3d" xmlns:o="urn:schemas-microsoft-com:office:office" xmlns:oel="http://schemas.microsoft.com/office/2019/extlst" xmlns:r="http://schemas.openxmlformats.org/officeDocument/2006/relationships" xmlns:m="http://schemas.openxmlformats.org/officeDocument/2006/math" xmlns:v="urn:schemas-microsoft-com:vml" xmlns:wp14="http://schemas.microsoft.com/office/word/2010/wordprocessingDrawing" xmlns:wp="http://schemas.openxmlformats.org/drawingml/2006/wordprocessingDrawing" xmlns:w10="urn:schemas-microsoft-com:office:word" xmlns:w="http://schemas.openxmlformats.org/wordprocessingml/2006/main" xmlns:w14="http://schemas.microsoft.com/office/word/2010/wordml" xmlns:w15="http://schemas.microsoft.com/office/word/2012/wordml" xmlns:w16cex="http://schemas.microsoft.com/office/word/2018/wordml/cex" xmlns:w16cid="http://schemas.microsoft.com/office/word/2016/wordml/cid" xmlns:w16="http://schemas.microsoft.com/office/word/2018/wordml" xmlns:w16du="http://schemas.microsoft.com/office/word/2023/wordml/word16du" xmlns:w16sdtdh="http://schemas.microsoft.com/office/word/2020/wordml/sdtdatahash" xmlns:w16sdtfl="http://schemas.microsoft.com/office/word/2024/wordml/sdtformatlock" xmlns:w16se="http://schemas.microsoft.com/office/word/2015/wordml/symex" xmlns:wpg="http://schemas.microsoft.com/office/word/2010/wordprocessingGroup" xmlns:wpi="http://schemas.microsoft.com/office/word/2010/wordprocessingInk" xmlns:wne="http://schemas.microsoft.com/office/word/2006/wordml" xmlns:wps="http://schemas.microsoft.com/office/word/2010/wordprocessingShape" mc:Ignorable="w14 w15 w16se w16cid w16 w16cex w16sdtdh w16sdtfl w16du wp14">
+<w:ftr xmlns:wpc="http://schemas.microsoft.com/office/word/2010/wordprocessingCanvas" xmlns:cx="http://schemas.microsoft.com/office/drawing/2014/chartex" xmlns:cx1="http://schemas.microsoft.com/office/drawing/2015/9/8/chartex" xmlns:cx2="http://schemas.microsoft.com/office/drawing/2015/10/21/chartex" xmlns:cx3="http://schemas.microsoft.com/office/drawing/2016/5/9/chartex" xmlns:cx4="http://schemas.microsoft.com/office/drawing/2016/5/10/chartex" xmlns:cx5="http://schemas.microsoft.com/office/drawing/2016/5/11/chartex" xmlns:cx6="http://schemas.microsoft.com/office/drawing/2016/5/12/chartex" xmlns:cx7="http://schemas.microsoft.com/office/drawing/2016/5/13/chartex" xmlns:cx8="http://schemas.microsoft.com/office/drawing/2016/5/14/chartex" xmlns:mc="http://schemas.openxmlformats.org/markup-compatibility/2006" xmlns:m="http://schemas.openxmlformats.org/officeDocument/2006/math" xmlns:aink="http://schemas.microsoft.com/office/drawing/2016/ink" xmlns:am3d="http://schemas.microsoft.com/office/drawing/2017/model3d" xmlns:oel="http://schemas.microsoft.com/office/2019/extlst" xmlns:r="http://schemas.openxmlformats.org/officeDocument/2006/relationships" xmlns:wp14="http://schemas.microsoft.com/office/word/2010/wordprocessingDrawing" xmlns:wp="http://schemas.openxmlformats.org/drawingml/2006/wordprocessingDrawing" xmlns:wpg="http://schemas.microsoft.com/office/word/2010/wordprocessingGroup" xmlns:wpi="http://schemas.microsoft.com/office/word/2010/wordprocessingInk" xmlns:wps="http://schemas.microsoft.com/office/word/2010/wordprocessingShape" xmlns:o="urn:schemas-microsoft-com:office:office" xmlns:v="urn:schemas-microsoft-com:vml" xmlns:w10="urn:schemas-microsoft-com:office:word" xmlns:w="http://schemas.openxmlformats.org/wordprocessingml/2006/main" xmlns:w14="http://schemas.microsoft.com/office/word/2010/wordml" xmlns:w15="http://schemas.microsoft.com/office/word/2012/wordml" xmlns:w16cex="http://schemas.microsoft.com/office/word/2018/wordml/cex" xmlns:w16cid="http://schemas.microsoft.com/office/word/2016/wordml/cid" xmlns:w16="http://schemas.microsoft.com/office/word/2018/wordml" xmlns:w16sdtdh="http://schemas.microsoft.com/office/word/2020/wordml/sdtdatahash" xmlns:w16sdtfl="http://schemas.microsoft.com/office/word/2024/wordml/sdtformatlock" xmlns:w16se="http://schemas.microsoft.com/office/word/2015/wordml/symex" xmlns:w16du="http://schemas.microsoft.com/office/word/2023/wordml/word16du" xmlns:wne="http://schemas.microsoft.com/office/word/2006/wordml" mc:Ignorable="w14 w15 w16se w16cid w16 w16cex w16sdtdh w16sdtfl w16du wp14">
   <w:p>
     <w:pPr>
       <w:pStyle w:val="Footer"/>
@@ -5851,7 +5860,7 @@
 </file>
 
 <file path=word/footer3.xml><?xml version="1.0" encoding="utf-8"?>
-<w:ftr xmlns:wpc="http://schemas.microsoft.com/office/word/2010/wordprocessingCanvas" xmlns:cx="http://schemas.microsoft.com/office/drawing/2014/chartex" xmlns:cx1="http://schemas.microsoft.com/office/drawing/2015/9/8/chartex" xmlns:cx2="http://schemas.microsoft.com/office/drawing/2015/10/21/chartex" xmlns:cx3="http://schemas.microsoft.com/office/drawing/2016/5/9/chartex" xmlns:cx4="http://schemas.microsoft.com/office/drawing/2016/5/10/chartex" xmlns:cx5="http://schemas.microsoft.com/office/drawing/2016/5/11/chartex" xmlns:cx6="http://schemas.microsoft.com/office/drawing/2016/5/12/chartex" xmlns:cx7="http://schemas.microsoft.com/office/drawing/2016/5/13/chartex" xmlns:cx8="http://schemas.microsoft.com/office/drawing/2016/5/14/chartex" xmlns:mc="http://schemas.openxmlformats.org/markup-compatibility/2006" xmlns:aink="http://schemas.microsoft.com/office/drawing/2016/ink" xmlns:am3d="http://schemas.microsoft.com/office/drawing/2017/model3d" xmlns:o="urn:schemas-microsoft-com:office:office" xmlns:oel="http://schemas.microsoft.com/office/2019/extlst" xmlns:r="http://schemas.openxmlformats.org/officeDocument/2006/relationships" xmlns:m="http://schemas.openxmlformats.org/officeDocument/2006/math" xmlns:v="urn:schemas-microsoft-com:vml" xmlns:wp14="http://schemas.microsoft.com/office/word/2010/wordprocessingDrawing" xmlns:wp="http://schemas.openxmlformats.org/drawingml/2006/wordprocessingDrawing" xmlns:w10="urn:schemas-microsoft-com:office:word" xmlns:w="http://schemas.openxmlformats.org/wordprocessingml/2006/main" xmlns:w14="http://schemas.microsoft.com/office/word/2010/wordml" xmlns:w15="http://schemas.microsoft.com/office/word/2012/wordml" xmlns:w16cex="http://schemas.microsoft.com/office/word/2018/wordml/cex" xmlns:w16cid="http://schemas.microsoft.com/office/word/2016/wordml/cid" xmlns:w16="http://schemas.microsoft.com/office/word/2018/wordml" xmlns:w16du="http://schemas.microsoft.com/office/word/2023/wordml/word16du" xmlns:w16sdtdh="http://schemas.microsoft.com/office/word/2020/wordml/sdtdatahash" xmlns:w16sdtfl="http://schemas.microsoft.com/office/word/2024/wordml/sdtformatlock" xmlns:w16se="http://schemas.microsoft.com/office/word/2015/wordml/symex" xmlns:wpg="http://schemas.microsoft.com/office/word/2010/wordprocessingGroup" xmlns:wpi="http://schemas.microsoft.com/office/word/2010/wordprocessingInk" xmlns:wne="http://schemas.microsoft.com/office/word/2006/wordml" xmlns:wps="http://schemas.microsoft.com/office/word/2010/wordprocessingShape" mc:Ignorable="w14 w15 w16se w16cid w16 w16cex w16sdtdh w16sdtfl w16du wp14">
+<w:ftr xmlns:wpc="http://schemas.microsoft.com/office/word/2010/wordprocessingCanvas" xmlns:cx="http://schemas.microsoft.com/office/drawing/2014/chartex" xmlns:cx1="http://schemas.microsoft.com/office/drawing/2015/9/8/chartex" xmlns:cx2="http://schemas.microsoft.com/office/drawing/2015/10/21/chartex" xmlns:cx3="http://schemas.microsoft.com/office/drawing/2016/5/9/chartex" xmlns:cx4="http://schemas.microsoft.com/office/drawing/2016/5/10/chartex" xmlns:cx5="http://schemas.microsoft.com/office/drawing/2016/5/11/chartex" xmlns:cx6="http://schemas.microsoft.com/office/drawing/2016/5/12/chartex" xmlns:cx7="http://schemas.microsoft.com/office/drawing/2016/5/13/chartex" xmlns:cx8="http://schemas.microsoft.com/office/drawing/2016/5/14/chartex" xmlns:mc="http://schemas.openxmlformats.org/markup-compatibility/2006" xmlns:m="http://schemas.openxmlformats.org/officeDocument/2006/math" xmlns:aink="http://schemas.microsoft.com/office/drawing/2016/ink" xmlns:am3d="http://schemas.microsoft.com/office/drawing/2017/model3d" xmlns:oel="http://schemas.microsoft.com/office/2019/extlst" xmlns:r="http://schemas.openxmlformats.org/officeDocument/2006/relationships" xmlns:wp14="http://schemas.microsoft.com/office/word/2010/wordprocessingDrawing" xmlns:wp="http://schemas.openxmlformats.org/drawingml/2006/wordprocessingDrawing" xmlns:wpg="http://schemas.microsoft.com/office/word/2010/wordprocessingGroup" xmlns:wpi="http://schemas.microsoft.com/office/word/2010/wordprocessingInk" xmlns:wps="http://schemas.microsoft.com/office/word/2010/wordprocessingShape" xmlns:o="urn:schemas-microsoft-com:office:office" xmlns:v="urn:schemas-microsoft-com:vml" xmlns:w10="urn:schemas-microsoft-com:office:word" xmlns:w="http://schemas.openxmlformats.org/wordprocessingml/2006/main" xmlns:w14="http://schemas.microsoft.com/office/word/2010/wordml" xmlns:w15="http://schemas.microsoft.com/office/word/2012/wordml" xmlns:w16cex="http://schemas.microsoft.com/office/word/2018/wordml/cex" xmlns:w16cid="http://schemas.microsoft.com/office/word/2016/wordml/cid" xmlns:w16="http://schemas.microsoft.com/office/word/2018/wordml" xmlns:w16sdtdh="http://schemas.microsoft.com/office/word/2020/wordml/sdtdatahash" xmlns:w16sdtfl="http://schemas.microsoft.com/office/word/2024/wordml/sdtformatlock" xmlns:w16se="http://schemas.microsoft.com/office/word/2015/wordml/symex" xmlns:w16du="http://schemas.microsoft.com/office/word/2023/wordml/word16du" xmlns:wne="http://schemas.microsoft.com/office/word/2006/wordml" mc:Ignorable="w14 w15 w16se w16cid w16 w16cex w16sdtdh w16sdtfl w16du wp14">
   <w:p>
     <w:pPr>
       <w:pStyle w:val="Footer"/>
@@ -5861,7 +5870,7 @@
 </file>
 
 <file path=word/footnotes.xml><?xml version="1.0" encoding="utf-8"?>
-<w:footnotes xmlns:wpc="http://schemas.microsoft.com/office/word/2010/wordprocessingCanvas" xmlns:cx="http://schemas.microsoft.com/office/drawing/2014/chartex" xmlns:cx1="http://schemas.microsoft.com/office/drawing/2015/9/8/chartex" xmlns:cx2="http://schemas.microsoft.com/office/drawing/2015/10/21/chartex" xmlns:cx3="http://schemas.microsoft.com/office/drawing/2016/5/9/chartex" xmlns:cx4="http://schemas.microsoft.com/office/drawing/2016/5/10/chartex" xmlns:cx5="http://schemas.microsoft.com/office/drawing/2016/5/11/chartex" xmlns:cx6="http://schemas.microsoft.com/office/drawing/2016/5/12/chartex" xmlns:cx7="http://schemas.microsoft.com/office/drawing/2016/5/13/chartex" xmlns:cx8="http://schemas.microsoft.com/office/drawing/2016/5/14/chartex" xmlns:mc="http://schemas.openxmlformats.org/markup-compatibility/2006" xmlns:aink="http://schemas.microsoft.com/office/drawing/2016/ink" xmlns:am3d="http://schemas.microsoft.com/office/drawing/2017/model3d" xmlns:o="urn:schemas-microsoft-com:office:office" xmlns:oel="http://schemas.microsoft.com/office/2019/extlst" xmlns:r="http://schemas.openxmlformats.org/officeDocument/2006/relationships" xmlns:m="http://schemas.openxmlformats.org/officeDocument/2006/math" xmlns:v="urn:schemas-microsoft-com:vml" xmlns:wp14="http://schemas.microsoft.com/office/word/2010/wordprocessingDrawing" xmlns:wp="http://schemas.openxmlformats.org/drawingml/2006/wordprocessingDrawing" xmlns:w10="urn:schemas-microsoft-com:office:word" xmlns:w="http://schemas.openxmlformats.org/wordprocessingml/2006/main" xmlns:w14="http://schemas.microsoft.com/office/word/2010/wordml" xmlns:w15="http://schemas.microsoft.com/office/word/2012/wordml" xmlns:w16cex="http://schemas.microsoft.com/office/word/2018/wordml/cex" xmlns:w16cid="http://schemas.microsoft.com/office/word/2016/wordml/cid" xmlns:w16="http://schemas.microsoft.com/office/word/2018/wordml" xmlns:w16du="http://schemas.microsoft.com/office/word/2023/wordml/word16du" xmlns:w16sdtdh="http://schemas.microsoft.com/office/word/2020/wordml/sdtdatahash" xmlns:w16sdtfl="http://schemas.microsoft.com/office/word/2024/wordml/sdtformatlock" xmlns:w16se="http://schemas.microsoft.com/office/word/2015/wordml/symex" xmlns:wpg="http://schemas.microsoft.com/office/word/2010/wordprocessingGroup" xmlns:wpi="http://schemas.microsoft.com/office/word/2010/wordprocessingInk" xmlns:wne="http://schemas.microsoft.com/office/word/2006/wordml" xmlns:wps="http://schemas.microsoft.com/office/word/2010/wordprocessingShape" mc:Ignorable="w14 w15 w16se w16cid w16 w16cex w16sdtdh w16sdtfl w16du wp14">
+<w:footnotes xmlns:wpc="http://schemas.microsoft.com/office/word/2010/wordprocessingCanvas" xmlns:cx="http://schemas.microsoft.com/office/drawing/2014/chartex" xmlns:cx1="http://schemas.microsoft.com/office/drawing/2015/9/8/chartex" xmlns:cx2="http://schemas.microsoft.com/office/drawing/2015/10/21/chartex" xmlns:cx3="http://schemas.microsoft.com/office/drawing/2016/5/9/chartex" xmlns:cx4="http://schemas.microsoft.com/office/drawing/2016/5/10/chartex" xmlns:cx5="http://schemas.microsoft.com/office/drawing/2016/5/11/chartex" xmlns:cx6="http://schemas.microsoft.com/office/drawing/2016/5/12/chartex" xmlns:cx7="http://schemas.microsoft.com/office/drawing/2016/5/13/chartex" xmlns:cx8="http://schemas.microsoft.com/office/drawing/2016/5/14/chartex" xmlns:mc="http://schemas.openxmlformats.org/markup-compatibility/2006" xmlns:m="http://schemas.openxmlformats.org/officeDocument/2006/math" xmlns:aink="http://schemas.microsoft.com/office/drawing/2016/ink" xmlns:am3d="http://schemas.microsoft.com/office/drawing/2017/model3d" xmlns:oel="http://schemas.microsoft.com/office/2019/extlst" xmlns:r="http://schemas.openxmlformats.org/officeDocument/2006/relationships" xmlns:wp14="http://schemas.microsoft.com/office/word/2010/wordprocessingDrawing" xmlns:wp="http://schemas.openxmlformats.org/drawingml/2006/wordprocessingDrawing" xmlns:wpg="http://schemas.microsoft.com/office/word/2010/wordprocessingGroup" xmlns:wpi="http://schemas.microsoft.com/office/word/2010/wordprocessingInk" xmlns:wps="http://schemas.microsoft.com/office/word/2010/wordprocessingShape" xmlns:o="urn:schemas-microsoft-com:office:office" xmlns:v="urn:schemas-microsoft-com:vml" xmlns:w10="urn:schemas-microsoft-com:office:word" xmlns:w="http://schemas.openxmlformats.org/wordprocessingml/2006/main" xmlns:w14="http://schemas.microsoft.com/office/word/2010/wordml" xmlns:w15="http://schemas.microsoft.com/office/word/2012/wordml" xmlns:w16cex="http://schemas.microsoft.com/office/word/2018/wordml/cex" xmlns:w16cid="http://schemas.microsoft.com/office/word/2016/wordml/cid" xmlns:w16="http://schemas.microsoft.com/office/word/2018/wordml" xmlns:w16sdtdh="http://schemas.microsoft.com/office/word/2020/wordml/sdtdatahash" xmlns:w16sdtfl="http://schemas.microsoft.com/office/word/2024/wordml/sdtformatlock" xmlns:w16se="http://schemas.microsoft.com/office/word/2015/wordml/symex" xmlns:w16du="http://schemas.microsoft.com/office/word/2023/wordml/word16du" xmlns:wne="http://schemas.microsoft.com/office/word/2006/wordml" mc:Ignorable="w14 w15 w16se w16cid w16 w16cex w16sdtdh w16sdtfl w16du wp14">
   <w:footnote w:type="separator" w:id="-1">
     <w:p>
       <w:r>
@@ -5880,7 +5889,7 @@
 </file>
 
 <file path=word/header1.xml><?xml version="1.0" encoding="utf-8"?>
-<w:hdr xmlns:wpc="http://schemas.microsoft.com/office/word/2010/wordprocessingCanvas" xmlns:cx="http://schemas.microsoft.com/office/drawing/2014/chartex" xmlns:cx1="http://schemas.microsoft.com/office/drawing/2015/9/8/chartex" xmlns:cx2="http://schemas.microsoft.com/office/drawing/2015/10/21/chartex" xmlns:cx3="http://schemas.microsoft.com/office/drawing/2016/5/9/chartex" xmlns:cx4="http://schemas.microsoft.com/office/drawing/2016/5/10/chartex" xmlns:cx5="http://schemas.microsoft.com/office/drawing/2016/5/11/chartex" xmlns:cx6="http://schemas.microsoft.com/office/drawing/2016/5/12/chartex" xmlns:cx7="http://schemas.microsoft.com/office/drawing/2016/5/13/chartex" xmlns:cx8="http://schemas.microsoft.com/office/drawing/2016/5/14/chartex" xmlns:mc="http://schemas.openxmlformats.org/markup-compatibility/2006" xmlns:aink="http://schemas.microsoft.com/office/drawing/2016/ink" xmlns:am3d="http://schemas.microsoft.com/office/drawing/2017/model3d" xmlns:o="urn:schemas-microsoft-com:office:office" xmlns:oel="http://schemas.microsoft.com/office/2019/extlst" xmlns:r="http://schemas.openxmlformats.org/officeDocument/2006/relationships" xmlns:m="http://schemas.openxmlformats.org/officeDocument/2006/math" xmlns:v="urn:schemas-microsoft-com:vml" xmlns:wp14="http://schemas.microsoft.com/office/word/2010/wordprocessingDrawing" xmlns:wp="http://schemas.openxmlformats.org/drawingml/2006/wordprocessingDrawing" xmlns:w10="urn:schemas-microsoft-com:office:word" xmlns:w="http://schemas.openxmlformats.org/wordprocessingml/2006/main" xmlns:w14="http://schemas.microsoft.com/office/word/2010/wordml" xmlns:w15="http://schemas.microsoft.com/office/word/2012/wordml" xmlns:w16cex="http://schemas.microsoft.com/office/word/2018/wordml/cex" xmlns:w16cid="http://schemas.microsoft.com/office/word/2016/wordml/cid" xmlns:w16="http://schemas.microsoft.com/office/word/2018/wordml" xmlns:w16du="http://schemas.microsoft.com/office/word/2023/wordml/word16du" xmlns:w16sdtdh="http://schemas.microsoft.com/office/word/2020/wordml/sdtdatahash" xmlns:w16sdtfl="http://schemas.microsoft.com/office/word/2024/wordml/sdtformatlock" xmlns:w16se="http://schemas.microsoft.com/office/word/2015/wordml/symex" xmlns:wpg="http://schemas.microsoft.com/office/word/2010/wordprocessingGroup" xmlns:wpi="http://schemas.microsoft.com/office/word/2010/wordprocessingInk" xmlns:wne="http://schemas.microsoft.com/office/word/2006/wordml" xmlns:wps="http://schemas.microsoft.com/office/word/2010/wordprocessingShape" mc:Ignorable="w14 w15 w16se w16cid w16 w16cex w16sdtdh w16sdtfl w16du wp14">
+<w:hdr xmlns:wpc="http://schemas.microsoft.com/office/word/2010/wordprocessingCanvas" xmlns:cx="http://schemas.microsoft.com/office/drawing/2014/chartex" xmlns:cx1="http://schemas.microsoft.com/office/drawing/2015/9/8/chartex" xmlns:cx2="http://schemas.microsoft.com/office/drawing/2015/10/21/chartex" xmlns:cx3="http://schemas.microsoft.com/office/drawing/2016/5/9/chartex" xmlns:cx4="http://schemas.microsoft.com/office/drawing/2016/5/10/chartex" xmlns:cx5="http://schemas.microsoft.com/office/drawing/2016/5/11/chartex" xmlns:cx6="http://schemas.microsoft.com/office/drawing/2016/5/12/chartex" xmlns:cx7="http://schemas.microsoft.com/office/drawing/2016/5/13/chartex" xmlns:cx8="http://schemas.microsoft.com/office/drawing/2016/5/14/chartex" xmlns:mc="http://schemas.openxmlformats.org/markup-compatibility/2006" xmlns:m="http://schemas.openxmlformats.org/officeDocument/2006/math" xmlns:aink="http://schemas.microsoft.com/office/drawing/2016/ink" xmlns:am3d="http://schemas.microsoft.com/office/drawing/2017/model3d" xmlns:oel="http://schemas.microsoft.com/office/2019/extlst" xmlns:r="http://schemas.openxmlformats.org/officeDocument/2006/relationships" xmlns:wp14="http://schemas.microsoft.com/office/word/2010/wordprocessingDrawing" xmlns:wp="http://schemas.openxmlformats.org/drawingml/2006/wordprocessingDrawing" xmlns:wpg="http://schemas.microsoft.com/office/word/2010/wordprocessingGroup" xmlns:wpi="http://schemas.microsoft.com/office/word/2010/wordprocessingInk" xmlns:wps="http://schemas.microsoft.com/office/word/2010/wordprocessingShape" xmlns:o="urn:schemas-microsoft-com:office:office" xmlns:v="urn:schemas-microsoft-com:vml" xmlns:w10="urn:schemas-microsoft-com:office:word" xmlns:w="http://schemas.openxmlformats.org/wordprocessingml/2006/main" xmlns:w14="http://schemas.microsoft.com/office/word/2010/wordml" xmlns:w15="http://schemas.microsoft.com/office/word/2012/wordml" xmlns:w16cex="http://schemas.microsoft.com/office/word/2018/wordml/cex" xmlns:w16cid="http://schemas.microsoft.com/office/word/2016/wordml/cid" xmlns:w16="http://schemas.microsoft.com/office/word/2018/wordml" xmlns:w16sdtdh="http://schemas.microsoft.com/office/word/2020/wordml/sdtdatahash" xmlns:w16sdtfl="http://schemas.microsoft.com/office/word/2024/wordml/sdtformatlock" xmlns:w16se="http://schemas.microsoft.com/office/word/2015/wordml/symex" xmlns:w16du="http://schemas.microsoft.com/office/word/2023/wordml/word16du" xmlns:wne="http://schemas.microsoft.com/office/word/2006/wordml" mc:Ignorable="w14 w15 w16se w16cid w16 w16cex w16sdtdh w16sdtfl w16du wp14">
   <w:p>
     <w:pPr>
       <w:pStyle w:val="Header"/>
@@ -5890,7 +5899,7 @@
 </file>
 
 <file path=word/header2.xml><?xml version="1.0" encoding="utf-8"?>
-<w:hdr xmlns:wpc="http://schemas.microsoft.com/office/word/2010/wordprocessingCanvas" xmlns:cx="http://schemas.microsoft.com/office/drawing/2014/chartex" xmlns:cx1="http://schemas.microsoft.com/office/drawing/2015/9/8/chartex" xmlns:cx2="http://schemas.microsoft.com/office/drawing/2015/10/21/chartex" xmlns:cx3="http://schemas.microsoft.com/office/drawing/2016/5/9/chartex" xmlns:cx4="http://schemas.microsoft.com/office/drawing/2016/5/10/chartex" xmlns:cx5="http://schemas.microsoft.com/office/drawing/2016/5/11/chartex" xmlns:cx6="http://schemas.microsoft.com/office/drawing/2016/5/12/chartex" xmlns:cx7="http://schemas.microsoft.com/office/drawing/2016/5/13/chartex" xmlns:cx8="http://schemas.microsoft.com/office/drawing/2016/5/14/chartex" xmlns:mc="http://schemas.openxmlformats.org/markup-compatibility/2006" xmlns:aink="http://schemas.microsoft.com/office/drawing/2016/ink" xmlns:am3d="http://schemas.microsoft.com/office/drawing/2017/model3d" xmlns:o="urn:schemas-microsoft-com:office:office" xmlns:oel="http://schemas.microsoft.com/office/2019/extlst" xmlns:r="http://schemas.openxmlformats.org/officeDocument/2006/relationships" xmlns:m="http://schemas.openxmlformats.org/officeDocument/2006/math" xmlns:v="urn:schemas-microsoft-com:vml" xmlns:wp14="http://schemas.microsoft.com/office/word/2010/wordprocessingDrawing" xmlns:wp="http://schemas.openxmlformats.org/drawingml/2006/wordprocessingDrawing" xmlns:w10="urn:schemas-microsoft-com:office:word" xmlns:w="http://schemas.openxmlformats.org/wordprocessingml/2006/main" xmlns:w14="http://schemas.microsoft.com/office/word/2010/wordml" xmlns:w15="http://schemas.microsoft.com/office/word/2012/wordml" xmlns:w16cex="http://schemas.microsoft.com/office/word/2018/wordml/cex" xmlns:w16cid="http://schemas.microsoft.com/office/word/2016/wordml/cid" xmlns:w16="http://schemas.microsoft.com/office/word/2018/wordml" xmlns:w16du="http://schemas.microsoft.com/office/word/2023/wordml/word16du" xmlns:w16sdtdh="http://schemas.microsoft.com/office/word/2020/wordml/sdtdatahash" xmlns:w16sdtfl="http://schemas.microsoft.com/office/word/2024/wordml/sdtformatlock" xmlns:w16se="http://schemas.microsoft.com/office/word/2015/wordml/symex" xmlns:wpg="http://schemas.microsoft.com/office/word/2010/wordprocessingGroup" xmlns:wpi="http://schemas.microsoft.com/office/word/2010/wordprocessingInk" xmlns:wne="http://schemas.microsoft.com/office/word/2006/wordml" xmlns:wps="http://schemas.microsoft.com/office/word/2010/wordprocessingShape" mc:Ignorable="w14 w15 w16se w16cid w16 w16cex w16sdtdh w16sdtfl w16du wp14">
+<w:hdr xmlns:wpc="http://schemas.microsoft.com/office/word/2010/wordprocessingCanvas" xmlns:cx="http://schemas.microsoft.com/office/drawing/2014/chartex" xmlns:cx1="http://schemas.microsoft.com/office/drawing/2015/9/8/chartex" xmlns:cx2="http://schemas.microsoft.com/office/drawing/2015/10/21/chartex" xmlns:cx3="http://schemas.microsoft.com/office/drawing/2016/5/9/chartex" xmlns:cx4="http://schemas.microsoft.com/office/drawing/2016/5/10/chartex" xmlns:cx5="http://schemas.microsoft.com/office/drawing/2016/5/11/chartex" xmlns:cx6="http://schemas.microsoft.com/office/drawing/2016/5/12/chartex" xmlns:cx7="http://schemas.microsoft.com/office/drawing/2016/5/13/chartex" xmlns:cx8="http://schemas.microsoft.com/office/drawing/2016/5/14/chartex" xmlns:mc="http://schemas.openxmlformats.org/markup-compatibility/2006" xmlns:m="http://schemas.openxmlformats.org/officeDocument/2006/math" xmlns:aink="http://schemas.microsoft.com/office/drawing/2016/ink" xmlns:am3d="http://schemas.microsoft.com/office/drawing/2017/model3d" xmlns:oel="http://schemas.microsoft.com/office/2019/extlst" xmlns:r="http://schemas.openxmlformats.org/officeDocument/2006/relationships" xmlns:wp14="http://schemas.microsoft.com/office/word/2010/wordprocessingDrawing" xmlns:wp="http://schemas.openxmlformats.org/drawingml/2006/wordprocessingDrawing" xmlns:wpg="http://schemas.microsoft.com/office/word/2010/wordprocessingGroup" xmlns:wpi="http://schemas.microsoft.com/office/word/2010/wordprocessingInk" xmlns:wps="http://schemas.microsoft.com/office/word/2010/wordprocessingShape" xmlns:o="urn:schemas-microsoft-com:office:office" xmlns:v="urn:schemas-microsoft-com:vml" xmlns:w10="urn:schemas-microsoft-com:office:word" xmlns:w="http://schemas.openxmlformats.org/wordprocessingml/2006/main" xmlns:w14="http://schemas.microsoft.com/office/word/2010/wordml" xmlns:w15="http://schemas.microsoft.com/office/word/2012/wordml" xmlns:w16cex="http://schemas.microsoft.com/office/word/2018/wordml/cex" xmlns:w16cid="http://schemas.microsoft.com/office/word/2016/wordml/cid" xmlns:w16="http://schemas.microsoft.com/office/word/2018/wordml" xmlns:w16sdtdh="http://schemas.microsoft.com/office/word/2020/wordml/sdtdatahash" xmlns:w16sdtfl="http://schemas.microsoft.com/office/word/2024/wordml/sdtformatlock" xmlns:w16se="http://schemas.microsoft.com/office/word/2015/wordml/symex" xmlns:w16du="http://schemas.microsoft.com/office/word/2023/wordml/word16du" xmlns:wne="http://schemas.microsoft.com/office/word/2006/wordml" mc:Ignorable="w14 w15 w16se w16cid w16 w16cex w16sdtdh w16sdtfl w16du wp14">
   <w:tbl>
     <w:tblPr>
       <w:tblW w:w="0" w:type="auto"/>
@@ -5926,7 +5935,7 @@
 </file>
 
 <file path=word/header3.xml><?xml version="1.0" encoding="utf-8"?>
-<w:hdr xmlns:wpc="http://schemas.microsoft.com/office/word/2010/wordprocessingCanvas" xmlns:cx="http://schemas.microsoft.com/office/drawing/2014/chartex" xmlns:cx1="http://schemas.microsoft.com/office/drawing/2015/9/8/chartex" xmlns:cx2="http://schemas.microsoft.com/office/drawing/2015/10/21/chartex" xmlns:cx3="http://schemas.microsoft.com/office/drawing/2016/5/9/chartex" xmlns:cx4="http://schemas.microsoft.com/office/drawing/2016/5/10/chartex" xmlns:cx5="http://schemas.microsoft.com/office/drawing/2016/5/11/chartex" xmlns:cx6="http://schemas.microsoft.com/office/drawing/2016/5/12/chartex" xmlns:cx7="http://schemas.microsoft.com/office/drawing/2016/5/13/chartex" xmlns:cx8="http://schemas.microsoft.com/office/drawing/2016/5/14/chartex" xmlns:mc="http://schemas.openxmlformats.org/markup-compatibility/2006" xmlns:aink="http://schemas.microsoft.com/office/drawing/2016/ink" xmlns:am3d="http://schemas.microsoft.com/office/drawing/2017/model3d" xmlns:o="urn:schemas-microsoft-com:office:office" xmlns:oel="http://schemas.microsoft.com/office/2019/extlst" xmlns:r="http://schemas.openxmlformats.org/officeDocument/2006/relationships" xmlns:m="http://schemas.openxmlformats.org/officeDocument/2006/math" xmlns:v="urn:schemas-microsoft-com:vml" xmlns:wp14="http://schemas.microsoft.com/office/word/2010/wordprocessingDrawing" xmlns:wp="http://schemas.openxmlformats.org/drawingml/2006/wordprocessingDrawing" xmlns:w10="urn:schemas-microsoft-com:office:word" xmlns:w="http://schemas.openxmlformats.org/wordprocessingml/2006/main" xmlns:w14="http://schemas.microsoft.com/office/word/2010/wordml" xmlns:w15="http://schemas.microsoft.com/office/word/2012/wordml" xmlns:w16cex="http://schemas.microsoft.com/office/word/2018/wordml/cex" xmlns:w16cid="http://schemas.microsoft.com/office/word/2016/wordml/cid" xmlns:w16="http://schemas.microsoft.com/office/word/2018/wordml" xmlns:w16du="http://schemas.microsoft.com/office/word/2023/wordml/word16du" xmlns:w16sdtdh="http://schemas.microsoft.com/office/word/2020/wordml/sdtdatahash" xmlns:w16sdtfl="http://schemas.microsoft.com/office/word/2024/wordml/sdtformatlock" xmlns:w16se="http://schemas.microsoft.com/office/word/2015/wordml/symex" xmlns:wpg="http://schemas.microsoft.com/office/word/2010/wordprocessingGroup" xmlns:wpi="http://schemas.microsoft.com/office/word/2010/wordprocessingInk" xmlns:wne="http://schemas.microsoft.com/office/word/2006/wordml" xmlns:wps="http://schemas.microsoft.com/office/word/2010/wordprocessingShape" mc:Ignorable="w14 w15 w16se w16cid w16 w16cex w16sdtdh w16sdtfl w16du wp14">
+<w:hdr xmlns:wpc="http://schemas.microsoft.com/office/word/2010/wordprocessingCanvas" xmlns:cx="http://schemas.microsoft.com/office/drawing/2014/chartex" xmlns:cx1="http://schemas.microsoft.com/office/drawing/2015/9/8/chartex" xmlns:cx2="http://schemas.microsoft.com/office/drawing/2015/10/21/chartex" xmlns:cx3="http://schemas.microsoft.com/office/drawing/2016/5/9/chartex" xmlns:cx4="http://schemas.microsoft.com/office/drawing/2016/5/10/chartex" xmlns:cx5="http://schemas.microsoft.com/office/drawing/2016/5/11/chartex" xmlns:cx6="http://schemas.microsoft.com/office/drawing/2016/5/12/chartex" xmlns:cx7="http://schemas.microsoft.com/office/drawing/2016/5/13/chartex" xmlns:cx8="http://schemas.microsoft.com/office/drawing/2016/5/14/chartex" xmlns:mc="http://schemas.openxmlformats.org/markup-compatibility/2006" xmlns:m="http://schemas.openxmlformats.org/officeDocument/2006/math" xmlns:aink="http://schemas.microsoft.com/office/drawing/2016/ink" xmlns:am3d="http://schemas.microsoft.com/office/drawing/2017/model3d" xmlns:oel="http://schemas.microsoft.com/office/2019/extlst" xmlns:r="http://schemas.openxmlformats.org/officeDocument/2006/relationships" xmlns:wp14="http://schemas.microsoft.com/office/word/2010/wordprocessingDrawing" xmlns:wp="http://schemas.openxmlformats.org/drawingml/2006/wordprocessingDrawing" xmlns:wpg="http://schemas.microsoft.com/office/word/2010/wordprocessingGroup" xmlns:wpi="http://schemas.microsoft.com/office/word/2010/wordprocessingInk" xmlns:wps="http://schemas.microsoft.com/office/word/2010/wordprocessingShape" xmlns:o="urn:schemas-microsoft-com:office:office" xmlns:v="urn:schemas-microsoft-com:vml" xmlns:w10="urn:schemas-microsoft-com:office:word" xmlns:w="http://schemas.openxmlformats.org/wordprocessingml/2006/main" xmlns:w14="http://schemas.microsoft.com/office/word/2010/wordml" xmlns:w15="http://schemas.microsoft.com/office/word/2012/wordml" xmlns:w16cex="http://schemas.microsoft.com/office/word/2018/wordml/cex" xmlns:w16cid="http://schemas.microsoft.com/office/word/2016/wordml/cid" xmlns:w16="http://schemas.microsoft.com/office/word/2018/wordml" xmlns:w16sdtdh="http://schemas.microsoft.com/office/word/2020/wordml/sdtdatahash" xmlns:w16sdtfl="http://schemas.microsoft.com/office/word/2024/wordml/sdtformatlock" xmlns:w16se="http://schemas.microsoft.com/office/word/2015/wordml/symex" xmlns:w16du="http://schemas.microsoft.com/office/word/2023/wordml/word16du" xmlns:wne="http://schemas.microsoft.com/office/word/2006/wordml" mc:Ignorable="w14 w15 w16se w16cid w16 w16cex w16sdtdh w16sdtfl w16du wp14">
   <w:p>
     <w:pPr>
       <w:pStyle w:val="Heading1"/>
@@ -6560,7 +6569,7 @@
 </file>
 
 <file path=word/numbering.xml><?xml version="1.0" encoding="utf-8"?>
-<w:numbering xmlns:wpc="http://schemas.microsoft.com/office/word/2010/wordprocessingCanvas" xmlns:cx="http://schemas.microsoft.com/office/drawing/2014/chartex" xmlns:cx1="http://schemas.microsoft.com/office/drawing/2015/9/8/chartex" xmlns:cx2="http://schemas.microsoft.com/office/drawing/2015/10/21/chartex" xmlns:cx3="http://schemas.microsoft.com/office/drawing/2016/5/9/chartex" xmlns:cx4="http://schemas.microsoft.com/office/drawing/2016/5/10/chartex" xmlns:cx5="http://schemas.microsoft.com/office/drawing/2016/5/11/chartex" xmlns:cx6="http://schemas.microsoft.com/office/drawing/2016/5/12/chartex" xmlns:cx7="http://schemas.microsoft.com/office/drawing/2016/5/13/chartex" xmlns:cx8="http://schemas.microsoft.com/office/drawing/2016/5/14/chartex" xmlns:mc="http://schemas.openxmlformats.org/markup-compatibility/2006" xmlns:aink="http://schemas.microsoft.com/office/drawing/2016/ink" xmlns:am3d="http://schemas.microsoft.com/office/drawing/2017/model3d" xmlns:o="urn:schemas-microsoft-com:office:office" xmlns:oel="http://schemas.microsoft.com/office/2019/extlst" xmlns:r="http://schemas.openxmlformats.org/officeDocument/2006/relationships" xmlns:m="http://schemas.openxmlformats.org/officeDocument/2006/math" xmlns:v="urn:schemas-microsoft-com:vml" xmlns:wp14="http://schemas.microsoft.com/office/word/2010/wordprocessingDrawing" xmlns:wp="http://schemas.openxmlformats.org/drawingml/2006/wordprocessingDrawing" xmlns:w10="urn:schemas-microsoft-com:office:word" xmlns:w="http://schemas.openxmlformats.org/wordprocessingml/2006/main" xmlns:w14="http://schemas.microsoft.com/office/word/2010/wordml" xmlns:w15="http://schemas.microsoft.com/office/word/2012/wordml" xmlns:w16cex="http://schemas.microsoft.com/office/word/2018/wordml/cex" xmlns:w16cid="http://schemas.microsoft.com/office/word/2016/wordml/cid" xmlns:w16="http://schemas.microsoft.com/office/word/2018/wordml" xmlns:w16du="http://schemas.microsoft.com/office/word/2023/wordml/word16du" xmlns:w16sdtdh="http://schemas.microsoft.com/office/word/2020/wordml/sdtdatahash" xmlns:w16sdtfl="http://schemas.microsoft.com/office/word/2024/wordml/sdtformatlock" xmlns:w16se="http://schemas.microsoft.com/office/word/2015/wordml/symex" xmlns:wpg="http://schemas.microsoft.com/office/word/2010/wordprocessingGroup" xmlns:wpi="http://schemas.microsoft.com/office/word/2010/wordprocessingInk" xmlns:wne="http://schemas.microsoft.com/office/word/2006/wordml" xmlns:wps="http://schemas.microsoft.com/office/word/2010/wordprocessingShape" mc:Ignorable="w14 w15 w16se w16cid w16 w16cex w16sdtdh w16sdtfl w16du wp14">
+<w:numbering xmlns:wpc="http://schemas.microsoft.com/office/word/2010/wordprocessingCanvas" xmlns:cx="http://schemas.microsoft.com/office/drawing/2014/chartex" xmlns:cx1="http://schemas.microsoft.com/office/drawing/2015/9/8/chartex" xmlns:cx2="http://schemas.microsoft.com/office/drawing/2015/10/21/chartex" xmlns:cx3="http://schemas.microsoft.com/office/drawing/2016/5/9/chartex" xmlns:cx4="http://schemas.microsoft.com/office/drawing/2016/5/10/chartex" xmlns:cx5="http://schemas.microsoft.com/office/drawing/2016/5/11/chartex" xmlns:cx6="http://schemas.microsoft.com/office/drawing/2016/5/12/chartex" xmlns:cx7="http://schemas.microsoft.com/office/drawing/2016/5/13/chartex" xmlns:cx8="http://schemas.microsoft.com/office/drawing/2016/5/14/chartex" xmlns:mc="http://schemas.openxmlformats.org/markup-compatibility/2006" xmlns:m="http://schemas.openxmlformats.org/officeDocument/2006/math" xmlns:aink="http://schemas.microsoft.com/office/drawing/2016/ink" xmlns:am3d="http://schemas.microsoft.com/office/drawing/2017/model3d" xmlns:oel="http://schemas.microsoft.com/office/2019/extlst" xmlns:r="http://schemas.openxmlformats.org/officeDocument/2006/relationships" xmlns:wp14="http://schemas.microsoft.com/office/word/2010/wordprocessingDrawing" xmlns:wp="http://schemas.openxmlformats.org/drawingml/2006/wordprocessingDrawing" xmlns:wpg="http://schemas.microsoft.com/office/word/2010/wordprocessingGroup" xmlns:wpi="http://schemas.microsoft.com/office/word/2010/wordprocessingInk" xmlns:wps="http://schemas.microsoft.com/office/word/2010/wordprocessingShape" xmlns:o="urn:schemas-microsoft-com:office:office" xmlns:v="urn:schemas-microsoft-com:vml" xmlns:w10="urn:schemas-microsoft-com:office:word" xmlns:w="http://schemas.openxmlformats.org/wordprocessingml/2006/main" xmlns:w14="http://schemas.microsoft.com/office/word/2010/wordml" xmlns:w15="http://schemas.microsoft.com/office/word/2012/wordml" xmlns:w16cex="http://schemas.microsoft.com/office/word/2018/wordml/cex" xmlns:w16cid="http://schemas.microsoft.com/office/word/2016/wordml/cid" xmlns:w16="http://schemas.microsoft.com/office/word/2018/wordml" xmlns:w16sdtdh="http://schemas.microsoft.com/office/word/2020/wordml/sdtdatahash" xmlns:w16sdtfl="http://schemas.microsoft.com/office/word/2024/wordml/sdtformatlock" xmlns:w16se="http://schemas.microsoft.com/office/word/2015/wordml/symex" xmlns:w16du="http://schemas.microsoft.com/office/word/2023/wordml/word16du" xmlns:wne="http://schemas.microsoft.com/office/word/2006/wordml" mc:Ignorable="w14 w15 w16se w16cid w16 w16cex w16sdtdh w16sdtfl w16du wp14">
   <w:abstractNum w:abstractNumId="0" w15:restartNumberingAfterBreak="0">
     <w:nsid w:val="00000001"/>
     <w:multiLevelType w:val="multilevel"/>
@@ -9394,7 +9403,7 @@
 </file>
 
 <file path=word/styles.xml><?xml version="1.0" encoding="utf-8"?>
-<w:styles xmlns:mc="http://schemas.openxmlformats.org/markup-compatibility/2006" xmlns:r="http://schemas.openxmlformats.org/officeDocument/2006/relationships" xmlns:w="http://schemas.openxmlformats.org/wordprocessingml/2006/main" xmlns:w14="http://schemas.microsoft.com/office/word/2010/wordml" xmlns:w15="http://schemas.microsoft.com/office/word/2012/wordml" xmlns:w16cex="http://schemas.microsoft.com/office/word/2018/wordml/cex" xmlns:w16cid="http://schemas.microsoft.com/office/word/2016/wordml/cid" xmlns:w16="http://schemas.microsoft.com/office/word/2018/wordml" xmlns:w16du="http://schemas.microsoft.com/office/word/2023/wordml/word16du" xmlns:w16sdtdh="http://schemas.microsoft.com/office/word/2020/wordml/sdtdatahash" xmlns:w16sdtfl="http://schemas.microsoft.com/office/word/2024/wordml/sdtformatlock" xmlns:w16se="http://schemas.microsoft.com/office/word/2015/wordml/symex" mc:Ignorable="w14 w15 w16se w16cid w16 w16cex w16sdtdh w16sdtfl w16du">
+<w:styles xmlns:mc="http://schemas.openxmlformats.org/markup-compatibility/2006" xmlns:r="http://schemas.openxmlformats.org/officeDocument/2006/relationships" xmlns:w="http://schemas.openxmlformats.org/wordprocessingml/2006/main" xmlns:w14="http://schemas.microsoft.com/office/word/2010/wordml" xmlns:w15="http://schemas.microsoft.com/office/word/2012/wordml" xmlns:w16cex="http://schemas.microsoft.com/office/word/2018/wordml/cex" xmlns:w16cid="http://schemas.microsoft.com/office/word/2016/wordml/cid" xmlns:w16="http://schemas.microsoft.com/office/word/2018/wordml" xmlns:w16sdtdh="http://schemas.microsoft.com/office/word/2020/wordml/sdtdatahash" xmlns:w16sdtfl="http://schemas.microsoft.com/office/word/2024/wordml/sdtformatlock" xmlns:w16se="http://schemas.microsoft.com/office/word/2015/wordml/symex" xmlns:w16du="http://schemas.microsoft.com/office/word/2023/wordml/word16du" mc:Ignorable="w14 w15 w16se w16cid w16 w16cex w16sdtdh w16sdtfl w16du">
   <w:docDefaults>
     <w:rPrDefault>
       <w:rPr>

</xml_diff>

<commit_message>
DO IT RIGHT THE FIRST TIME
</commit_message>
<xml_diff>
--- a/AJAYKUMAR_DHANDAPANI.docx
+++ b/AJAYKUMAR_DHANDAPANI.docx
@@ -138,7 +138,111 @@
           <w:sz w:val="20"/>
           <w:szCs w:val="20"/>
         </w:rPr>
-        <w:t>10+ years of experience in designing and delivering enterprise grade web applications, micro services and cloud native solutions</w:t>
+        <w:t xml:space="preserve">10+ years of </w:t>
+      </w:r>
+      <w:r>
+        <w:rPr>
+          <w:rFonts w:cs="Calibri"/>
+          <w:sz w:val="20"/>
+          <w:szCs w:val="20"/>
+        </w:rPr>
+        <w:t>expertise</w:t>
+      </w:r>
+      <w:r>
+        <w:rPr>
+          <w:rFonts w:cs="Calibri"/>
+          <w:sz w:val="20"/>
+          <w:szCs w:val="20"/>
+        </w:rPr>
+        <w:t xml:space="preserve"> in designing and delivering enterprise grade web applications, micro services and cloud native solutions</w:t>
+      </w:r>
+      <w:r>
+        <w:rPr>
+          <w:rFonts w:cs="Calibri"/>
+          <w:sz w:val="20"/>
+          <w:szCs w:val="20"/>
+        </w:rPr>
+        <w:t xml:space="preserve"> guided by  “Do</w:t>
+      </w:r>
+      <w:r>
+        <w:rPr>
+          <w:rFonts w:cs="Calibri"/>
+          <w:sz w:val="20"/>
+          <w:szCs w:val="20"/>
+        </w:rPr>
+        <w:t xml:space="preserve"> </w:t>
+      </w:r>
+      <w:r>
+        <w:rPr>
+          <w:rFonts w:cs="Calibri"/>
+          <w:sz w:val="20"/>
+          <w:szCs w:val="20"/>
+        </w:rPr>
+        <w:t>IT</w:t>
+      </w:r>
+      <w:r>
+        <w:rPr>
+          <w:rFonts w:cs="Calibri"/>
+          <w:sz w:val="20"/>
+          <w:szCs w:val="20"/>
+        </w:rPr>
+        <w:t xml:space="preserve"> </w:t>
+      </w:r>
+      <w:r>
+        <w:rPr>
+          <w:rFonts w:cs="Calibri"/>
+          <w:sz w:val="20"/>
+          <w:szCs w:val="20"/>
+        </w:rPr>
+        <w:t>right</w:t>
+      </w:r>
+      <w:r>
+        <w:rPr>
+          <w:rFonts w:cs="Calibri"/>
+          <w:sz w:val="20"/>
+          <w:szCs w:val="20"/>
+        </w:rPr>
+        <w:t xml:space="preserve"> </w:t>
+      </w:r>
+      <w:r>
+        <w:rPr>
+          <w:rFonts w:cs="Calibri"/>
+          <w:sz w:val="20"/>
+          <w:szCs w:val="20"/>
+        </w:rPr>
+        <w:t>the</w:t>
+      </w:r>
+      <w:r>
+        <w:rPr>
+          <w:rFonts w:cs="Calibri"/>
+          <w:sz w:val="20"/>
+          <w:szCs w:val="20"/>
+        </w:rPr>
+        <w:t xml:space="preserve"> </w:t>
+      </w:r>
+      <w:r>
+        <w:rPr>
+          <w:rFonts w:cs="Calibri"/>
+          <w:sz w:val="20"/>
+          <w:szCs w:val="20"/>
+        </w:rPr>
+        <w:t>first</w:t>
+      </w:r>
+      <w:r>
+        <w:rPr>
+          <w:rFonts w:cs="Calibri"/>
+          <w:sz w:val="20"/>
+          <w:szCs w:val="20"/>
+        </w:rPr>
+        <w:t xml:space="preserve"> </w:t>
+      </w:r>
+      <w:r>
+        <w:rPr>
+          <w:rFonts w:cs="Calibri"/>
+          <w:sz w:val="20"/>
+          <w:szCs w:val="20"/>
+        </w:rPr>
+        <w:t>time” engineering philosophy</w:t>
       </w:r>
     </w:p>
     <w:p>

</xml_diff>